<commit_message>
added chatbot and complement FSA algorithm
</commit_message>
<xml_diff>
--- a/report.docx
+++ b/report.docx
@@ -2788,6 +2788,96 @@
       </w:r>
       <w:bookmarkEnd w:id="3"/>
     </w:p>
+    <w:p>
+      <w:pPr>
+        <w:pStyle w:val="TableofFigures"/>
+        <w:tabs>
+          <w:tab w:val="right" w:leader="dot" w:pos="9016"/>
+        </w:tabs>
+        <w:rPr>
+          <w:noProof/>
+        </w:rPr>
+      </w:pPr>
+      <w:r>
+        <w:fldChar w:fldCharType="begin"/>
+      </w:r>
+      <w:r>
+        <w:instrText xml:space="preserve"> TOC \h \z \c "Figure" </w:instrText>
+      </w:r>
+      <w:r>
+        <w:fldChar w:fldCharType="separate"/>
+      </w:r>
+      <w:hyperlink w:anchor="_Toc240746842" w:history="1">
+        <w:r>
+          <w:rPr>
+            <w:rStyle w:val="Hyperlink"/>
+            <w:noProof/>
+          </w:rPr>
+          <w:t>Figure 1</w:t>
+        </w:r>
+        <w:r>
+          <w:rPr>
+            <w:rStyle w:val="Hyperlink"/>
+            <w:noProof/>
+            <w:lang w:val="en-US"/>
+          </w:rPr>
+          <w:t>: system architecture overview</w:t>
+        </w:r>
+        <w:r>
+          <w:rPr>
+            <w:noProof/>
+            <w:webHidden/>
+          </w:rPr>
+          <w:tab/>
+        </w:r>
+        <w:r>
+          <w:rPr>
+            <w:noProof/>
+            <w:webHidden/>
+          </w:rPr>
+          <w:fldChar w:fldCharType="begin"/>
+        </w:r>
+        <w:r>
+          <w:rPr>
+            <w:noProof/>
+            <w:webHidden/>
+          </w:rPr>
+          <w:instrText xml:space="preserve"> PAGEREF _Toc240746842 \h </w:instrText>
+        </w:r>
+        <w:r>
+          <w:rPr>
+            <w:noProof/>
+            <w:webHidden/>
+          </w:rPr>
+        </w:r>
+        <w:r>
+          <w:rPr>
+            <w:noProof/>
+            <w:webHidden/>
+          </w:rPr>
+          <w:fldChar w:fldCharType="separate"/>
+        </w:r>
+        <w:r>
+          <w:rPr>
+            <w:noProof/>
+            <w:webHidden/>
+          </w:rPr>
+          <w:t>10</w:t>
+        </w:r>
+        <w:r>
+          <w:rPr>
+            <w:noProof/>
+            <w:webHidden/>
+          </w:rPr>
+          <w:fldChar w:fldCharType="end"/>
+        </w:r>
+      </w:hyperlink>
+    </w:p>
+    <w:p>
+      <w:r>
+        <w:fldChar w:fldCharType="end"/>
+      </w:r>
+    </w:p>
     <w:p/>
     <w:p/>
     <w:p/>
@@ -2800,7 +2890,6 @@
     <w:p/>
     <w:p/>
     <w:p/>
-    <w:p/>
     <w:p>
       <w:pPr>
         <w:pStyle w:val="Heading1"/>
@@ -3136,13 +3225,7 @@
         <w:ind w:firstLine="720"/>
       </w:pPr>
       <w:r>
-        <w:t>Among existing solutions, JFLAP stands out as the prevailing industry and academic standard for automata simulation. To evaluate its practical suitability for modern academic work</w:t>
-      </w:r>
-      <w:r>
-        <w:t>f</w:t>
-      </w:r>
-      <w:r>
-        <w:t>lows, this analysis examines the tool across three main dimensions: user interface and accessibility, offered functionality, and technical architecture.</w:t>
+        <w:t>Among existing solutions, JFLAP stands out as the prevailing industry and academic standard for automata simulation. To evaluate its practical suitability for modern academic workflows, this analysis examines the tool across three main dimensions: user interface and accessibility, offered functionality, and technical architecture.</w:t>
       </w:r>
     </w:p>
     <w:p>
@@ -3521,19 +3604,7 @@
         <w:rPr>
           <w:rFonts w:cs="CMU Serif"/>
         </w:rPr>
-        <w:t xml:space="preserve"> These browser-based applications require zero installation and offer a smoother user experience than legacy desktop software. However, they are typically surface-level simulations that rarely support advanced models like Linear Bounded Automata (LBA) or complex non-deterministic </w:t>
-      </w:r>
-      <w:r>
-        <w:rPr>
-          <w:rFonts w:cs="CMU Serif"/>
-        </w:rPr>
-        <w:t>behaviours</w:t>
-      </w:r>
-      <w:r>
-        <w:rPr>
-          <w:rFonts w:cs="CMU Serif"/>
-        </w:rPr>
-        <w:t>.</w:t>
+        <w:t xml:space="preserve"> These browser-based applications require zero installation and offer a smoother user experience than legacy desktop software. However, they are typically surface-level simulations that rarely support advanced models like Linear Bounded Automata (LBA) or complex non-deterministic behaviours.</w:t>
       </w:r>
     </w:p>
     <w:p>
@@ -3908,110 +3979,888 @@
     <w:p>
       <w:pPr>
         <w:ind w:firstLine="720"/>
+      </w:pPr>
+      <w:r>
+        <w:t xml:space="preserve">At the highest level, the proposed design can be visualized as two main components: the </w:t>
+      </w:r>
+      <w:r>
+        <w:rPr>
+          <w:b/>
+          <w:bCs/>
+        </w:rPr>
+        <w:t>M19 engine</w:t>
+      </w:r>
+      <w:r>
+        <w:t xml:space="preserve">, responsible for managing the simulation process, and a </w:t>
+      </w:r>
+      <w:r>
+        <w:rPr>
+          <w:b/>
+          <w:bCs/>
+        </w:rPr>
+        <w:t>frontend layer</w:t>
+      </w:r>
+      <w:r>
+        <w:t xml:space="preserve">, responsible for user interaction and visualization. The engine follows an </w:t>
+      </w:r>
+      <w:r>
+        <w:rPr>
+          <w:b/>
+          <w:bCs/>
+        </w:rPr>
+        <w:t>imperative paradigm</w:t>
+      </w:r>
+      <w:r>
+        <w:t xml:space="preserve">, explicitly controlling each execution step, state transition, and internal data management operation. In contrast, the frontend follows a </w:t>
+      </w:r>
+      <w:r>
+        <w:rPr>
+          <w:b/>
+          <w:bCs/>
+        </w:rPr>
+        <w:t>declarative approach</w:t>
+      </w:r>
+      <w:r>
+        <w:t xml:space="preserve">, describing how the current state of the simulation should be represented visually based on the data received from the engine. This separation allows the execution logic to remain independent of the presentation layer. These components are connected through an </w:t>
+      </w:r>
+      <w:r>
+        <w:rPr>
+          <w:b/>
+          <w:bCs/>
+        </w:rPr>
+        <w:t>API</w:t>
+      </w:r>
+      <w:r>
+        <w:t>, which exposes the data required by the frontend to represent and interact with the current state of the simulation.</w:t>
+      </w:r>
+      <w:r>
+        <w:t xml:space="preserve"> </w:t>
+      </w:r>
+    </w:p>
+    <w:p>
+      <w:pPr>
         <w:rPr>
           <w:rFonts w:ascii="Georgia" w:hAnsi="Georgia"/>
         </w:rPr>
       </w:pPr>
       <w:r>
         <w:rPr>
+          <w:noProof/>
+        </w:rPr>
+        <w:lastRenderedPageBreak/>
+        <mc:AlternateContent>
+          <mc:Choice Requires="wps">
+            <w:drawing>
+              <wp:anchor distT="0" distB="0" distL="114300" distR="114300" simplePos="0" relativeHeight="251661312" behindDoc="0" locked="0" layoutInCell="1" allowOverlap="1" wp14:anchorId="2697F731" wp14:editId="5CD62774">
+                <wp:simplePos x="0" y="0"/>
+                <wp:positionH relativeFrom="column">
+                  <wp:posOffset>-38100</wp:posOffset>
+                </wp:positionH>
+                <wp:positionV relativeFrom="paragraph">
+                  <wp:posOffset>3312160</wp:posOffset>
+                </wp:positionV>
+                <wp:extent cx="5731510" cy="635"/>
+                <wp:effectExtent l="0" t="0" r="2540" b="9525"/>
+                <wp:wrapSquare wrapText="bothSides"/>
+                <wp:docPr id="3" name="Text Box 3"/>
+                <wp:cNvGraphicFramePr/>
+                <a:graphic xmlns:a="http://schemas.openxmlformats.org/drawingml/2006/main">
+                  <a:graphicData uri="http://schemas.microsoft.com/office/word/2010/wordprocessingShape">
+                    <wps:wsp>
+                      <wps:cNvSpPr txBox="1"/>
+                      <wps:spPr>
+                        <a:xfrm>
+                          <a:off x="0" y="0"/>
+                          <a:ext cx="5731510" cy="635"/>
+                        </a:xfrm>
+                        <a:prstGeom prst="rect">
+                          <a:avLst/>
+                        </a:prstGeom>
+                        <a:noFill/>
+                        <a:ln>
+                          <a:noFill/>
+                        </a:ln>
+                      </wps:spPr>
+                      <wps:txbx>
+                        <w:txbxContent>
+                          <w:p>
+                            <w:pPr>
+                              <w:pStyle w:val="Caption"/>
+                              <w:jc w:val="center"/>
+                              <w:rPr>
+                                <w:rFonts w:ascii="Georgia" w:hAnsi="Georgia"/>
+                                <w:noProof/>
+                              </w:rPr>
+                            </w:pPr>
+                            <w:bookmarkStart w:id="16" w:name="_Toc240746842"/>
+                            <w:r>
+                              <w:t xml:space="preserve">Figure </w:t>
+                            </w:r>
+                            <w:r>
+                              <w:fldChar w:fldCharType="begin"/>
+                            </w:r>
+                            <w:r>
+                              <w:instrText xml:space="preserve"> SEQ Figure \* ARABIC </w:instrText>
+                            </w:r>
+                            <w:r>
+                              <w:fldChar w:fldCharType="separate"/>
+                            </w:r>
+                            <w:r>
+                              <w:rPr>
+                                <w:noProof/>
+                              </w:rPr>
+                              <w:t>1</w:t>
+                            </w:r>
+                            <w:r>
+                              <w:fldChar w:fldCharType="end"/>
+                            </w:r>
+                            <w:r>
+                              <w:rPr>
+                                <w:lang w:val="en-US"/>
+                              </w:rPr>
+                              <w:t>: system architecture overview</w:t>
+                            </w:r>
+                            <w:bookmarkEnd w:id="16"/>
+                          </w:p>
+                        </w:txbxContent>
+                      </wps:txbx>
+                      <wps:bodyPr rot="0" spcFirstLastPara="0" vertOverflow="overflow" horzOverflow="overflow" vert="horz" wrap="square" lIns="0" tIns="0" rIns="0" bIns="0" numCol="1" spcCol="0" rtlCol="0" fromWordArt="0" anchor="t" anchorCtr="0" forceAA="0" compatLnSpc="1">
+                        <a:prstTxWarp prst="textNoShape">
+                          <a:avLst/>
+                        </a:prstTxWarp>
+                        <a:spAutoFit/>
+                      </wps:bodyPr>
+                    </wps:wsp>
+                  </a:graphicData>
+                </a:graphic>
+              </wp:anchor>
+            </w:drawing>
+          </mc:Choice>
+          <mc:Fallback>
+            <w:pict>
+              <v:shapetype w14:anchorId="2697F731" id="_x0000_t202" coordsize="21600,21600" o:spt="202" path="m,l,21600r21600,l21600,xe">
+                <v:stroke joinstyle="miter"/>
+                <v:path gradientshapeok="t" o:connecttype="rect"/>
+              </v:shapetype>
+              <v:shape id="Text Box 3" o:spid="_x0000_s1026" type="#_x0000_t202" style="position:absolute;margin-left:-3pt;margin-top:260.8pt;width:451.3pt;height:.05pt;z-index:251661312;visibility:visible;mso-wrap-style:square;mso-wrap-distance-left:9pt;mso-wrap-distance-top:0;mso-wrap-distance-right:9pt;mso-wrap-distance-bottom:0;mso-position-horizontal:absolute;mso-position-horizontal-relative:text;mso-position-vertical:absolute;mso-position-vertical-relative:text;v-text-anchor:top" o:gfxdata="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" filled="f" stroked="f">
+                <v:textbox style="mso-fit-shape-to-text:t" inset="0,0,0,0">
+                  <w:txbxContent>
+                    <w:p>
+                      <w:pPr>
+                        <w:pStyle w:val="Caption"/>
+                        <w:jc w:val="center"/>
+                        <w:rPr>
+                          <w:rFonts w:ascii="Georgia" w:hAnsi="Georgia"/>
+                          <w:noProof/>
+                        </w:rPr>
+                      </w:pPr>
+                      <w:bookmarkStart w:id="17" w:name="_Toc240746842"/>
+                      <w:r>
+                        <w:t xml:space="preserve">Figure </w:t>
+                      </w:r>
+                      <w:r>
+                        <w:fldChar w:fldCharType="begin"/>
+                      </w:r>
+                      <w:r>
+                        <w:instrText xml:space="preserve"> SEQ Figure \* ARABIC </w:instrText>
+                      </w:r>
+                      <w:r>
+                        <w:fldChar w:fldCharType="separate"/>
+                      </w:r>
+                      <w:r>
+                        <w:rPr>
+                          <w:noProof/>
+                        </w:rPr>
+                        <w:t>1</w:t>
+                      </w:r>
+                      <w:r>
+                        <w:fldChar w:fldCharType="end"/>
+                      </w:r>
+                      <w:r>
+                        <w:rPr>
+                          <w:lang w:val="en-US"/>
+                        </w:rPr>
+                        <w:t>: system architecture overview</w:t>
+                      </w:r>
+                      <w:bookmarkEnd w:id="17"/>
+                    </w:p>
+                  </w:txbxContent>
+                </v:textbox>
+                <w10:wrap type="square"/>
+              </v:shape>
+            </w:pict>
+          </mc:Fallback>
+        </mc:AlternateContent>
+      </w:r>
+      <w:r>
+        <w:rPr>
           <w:rFonts w:ascii="Georgia" w:hAnsi="Georgia"/>
-        </w:rPr>
-        <w:t xml:space="preserve">At the highest level, the proposed design can be visualized as two main components: the </w:t>
-      </w:r>
-      <w:r>
+          <w:noProof/>
+        </w:rPr>
+        <w:drawing>
+          <wp:anchor distT="0" distB="0" distL="114300" distR="114300" simplePos="0" relativeHeight="251659264" behindDoc="0" locked="0" layoutInCell="1" allowOverlap="1" wp14:anchorId="2AD22291" wp14:editId="4A264E27">
+            <wp:simplePos x="0" y="0"/>
+            <wp:positionH relativeFrom="column">
+              <wp:posOffset>-38100</wp:posOffset>
+            </wp:positionH>
+            <wp:positionV relativeFrom="paragraph">
+              <wp:posOffset>0</wp:posOffset>
+            </wp:positionV>
+            <wp:extent cx="5731510" cy="3255010"/>
+            <wp:effectExtent l="0" t="0" r="2540" b="2540"/>
+            <wp:wrapSquare wrapText="bothSides"/>
+            <wp:docPr id="2" name="Picture 2"/>
+            <wp:cNvGraphicFramePr>
+              <a:graphicFrameLocks xmlns:a="http://schemas.openxmlformats.org/drawingml/2006/main" noChangeAspect="1"/>
+            </wp:cNvGraphicFramePr>
+            <a:graphic xmlns:a="http://schemas.openxmlformats.org/drawingml/2006/main">
+              <a:graphicData uri="http://schemas.openxmlformats.org/drawingml/2006/picture">
+                <pic:pic xmlns:pic="http://schemas.openxmlformats.org/drawingml/2006/picture">
+                  <pic:nvPicPr>
+                    <pic:cNvPr id="2" name="Picture 2"/>
+                    <pic:cNvPicPr/>
+                  </pic:nvPicPr>
+                  <pic:blipFill>
+                    <a:blip r:embed="rId9" cstate="print">
+                      <a:extLst>
+                        <a:ext uri="{28A0092B-C50C-407E-A947-70E740481C1C}">
+                          <a14:useLocalDpi xmlns:a14="http://schemas.microsoft.com/office/drawing/2010/main" val="0"/>
+                        </a:ext>
+                      </a:extLst>
+                    </a:blip>
+                    <a:stretch>
+                      <a:fillRect/>
+                    </a:stretch>
+                  </pic:blipFill>
+                  <pic:spPr>
+                    <a:xfrm>
+                      <a:off x="0" y="0"/>
+                      <a:ext cx="5731510" cy="3255010"/>
+                    </a:xfrm>
+                    <a:prstGeom prst="rect">
+                      <a:avLst/>
+                    </a:prstGeom>
+                  </pic:spPr>
+                </pic:pic>
+              </a:graphicData>
+            </a:graphic>
+            <wp14:sizeRelH relativeFrom="page">
+              <wp14:pctWidth>0</wp14:pctWidth>
+            </wp14:sizeRelH>
+            <wp14:sizeRelV relativeFrom="page">
+              <wp14:pctHeight>0</wp14:pctHeight>
+            </wp14:sizeRelV>
+          </wp:anchor>
+        </w:drawing>
+      </w:r>
+    </w:p>
+    <w:p>
+      <w:pPr>
+        <w:pStyle w:val="Heading3"/>
+        <w:rPr>
+          <w:b/>
+          <w:bCs/>
+        </w:rPr>
+      </w:pPr>
+      <w:bookmarkStart w:id="18" w:name="_Toc240246363"/>
+      <w:r>
+        <w:rPr>
+          <w:b/>
+          <w:bCs/>
+        </w:rPr>
+        <w:t>M19 Engine Architecture</w:t>
+      </w:r>
+      <w:bookmarkEnd w:id="18"/>
+    </w:p>
+    <w:p>
+      <w:pPr>
+        <w:ind w:firstLine="720"/>
         <w:rPr>
           <w:rFonts w:ascii="Georgia" w:hAnsi="Georgia"/>
-          <w:b/>
-          <w:bCs/>
-        </w:rPr>
-        <w:t>M19 engine</w:t>
-      </w:r>
+        </w:rPr>
+      </w:pPr>
       <w:r>
         <w:rPr>
           <w:rFonts w:ascii="Georgia" w:hAnsi="Georgia"/>
         </w:rPr>
-        <w:t xml:space="preserve">, responsible for managing the simulation process, and a </w:t>
-      </w:r>
-      <w:r>
+        <w:t>The M19 engine had to be both performant and flexible. To achieve this, we decided to adopt a Structure of Arrays (SoA) approach for data management within the engine. This approach has been shown to provide improved cache locality for certain workloads, reducing the frequency of cache misses and, consequently, the time spent waiting for data to be retrieved from main memory. [Citation]</w:t>
+      </w:r>
+    </w:p>
+    <w:p>
+      <w:pPr>
+        <w:ind w:firstLine="720"/>
         <w:rPr>
           <w:rFonts w:ascii="Georgia" w:hAnsi="Georgia"/>
-          <w:b/>
-          <w:bCs/>
-        </w:rPr>
-        <w:t>frontend layer</w:t>
-      </w:r>
+        </w:rPr>
+      </w:pPr>
       <w:r>
         <w:rPr>
           <w:rFonts w:ascii="Georgia" w:hAnsi="Georgia"/>
         </w:rPr>
-        <w:t xml:space="preserve">, responsible for user interaction and visualization. The engine follows an </w:t>
-      </w:r>
-      <w:r>
+        <w:t>Beyond its performance characteristics, this representation also supports the management of multiple machine instances simultaneously. This is particularly important for handling nondeterministic machines, where a single execution step may result in multiple possible states that must be processed concurrently.</w:t>
+      </w:r>
+    </w:p>
+    <w:p>
+      <w:pPr>
+        <w:ind w:firstLine="720"/>
         <w:rPr>
           <w:rFonts w:ascii="Georgia" w:hAnsi="Georgia"/>
-          <w:b/>
-          <w:bCs/>
-        </w:rPr>
-        <w:t>imperative paradigm</w:t>
-      </w:r>
+        </w:rPr>
+      </w:pPr>
       <w:r>
         <w:rPr>
           <w:rFonts w:ascii="Georgia" w:hAnsi="Georgia"/>
         </w:rPr>
-        <w:t xml:space="preserve">, explicitly controlling each execution step, state transition, and internal data management operation. In contrast, the frontend follows a </w:t>
-      </w:r>
-      <w:r>
+        <w:t>The execution loop is then configured at instantiation time through the engine's constructor, effectively determining the execution strategy of a given engine instance before the simulation begins. The following class diagram details the internal architecture of the M19 engine and illustrates the relationships between its main components.</w:t>
+      </w:r>
+    </w:p>
+    <w:p>
+      <w:pPr>
+        <w:pStyle w:val="Heading3"/>
+        <w:rPr>
+          <w:b/>
+          <w:bCs/>
+        </w:rPr>
+      </w:pPr>
+      <w:bookmarkStart w:id="19" w:name="_Toc240246364"/>
+      <w:r>
+        <w:rPr>
+          <w:b/>
+          <w:bCs/>
+        </w:rPr>
+        <w:t>Included Algorithms</w:t>
+      </w:r>
+      <w:bookmarkEnd w:id="19"/>
+    </w:p>
+    <w:p>
+      <w:r>
+        <w:t>Mirror Automaton:</w:t>
+      </w:r>
+    </w:p>
+    <w:p>
+      <w:r>
+        <w:t xml:space="preserve">Non-Deterministic </w:t>
+      </w:r>
+      <w:r>
+        <w:t>Automaton</w:t>
+      </w:r>
+      <w:r>
+        <w:t xml:space="preserve"> to Deterministic Automaton</w:t>
+      </w:r>
+      <w:r>
+        <w:t>:</w:t>
+      </w:r>
+    </w:p>
+    <w:p>
+      <w:r>
+        <w:t>Degeneralisation of an automaton</w:t>
+      </w:r>
+      <w:r>
+        <w:t>:</w:t>
+      </w:r>
+    </w:p>
+    <w:p>
+      <w:pPr>
+        <w:pStyle w:val="Heading3"/>
+        <w:rPr>
+          <w:b/>
+          <w:bCs/>
+        </w:rPr>
+      </w:pPr>
+      <w:bookmarkStart w:id="20" w:name="_Toc240246365"/>
+      <w:r>
+        <w:rPr>
+          <w:b/>
+          <w:bCs/>
+        </w:rPr>
+        <w:lastRenderedPageBreak/>
+        <w:t>Parsing and Execution Control</w:t>
+      </w:r>
+      <w:bookmarkEnd w:id="20"/>
+    </w:p>
+    <w:p>
+      <w:pPr>
+        <w:ind w:firstLine="720"/>
         <w:rPr>
           <w:rFonts w:ascii="Georgia" w:hAnsi="Georgia"/>
-          <w:b/>
-          <w:bCs/>
-        </w:rPr>
-        <w:t>declarative approach</w:t>
-      </w:r>
+        </w:rPr>
+      </w:pPr>
       <w:r>
         <w:rPr>
           <w:rFonts w:ascii="Georgia" w:hAnsi="Georgia"/>
         </w:rPr>
-        <w:t xml:space="preserve">, describing how the current state of the simulation should be represented visually based on the data received from the engine. This separation allows the execution logic to remain independent of the presentation layer. These components are connected through an </w:t>
+        <w:t>Execution</w:t>
       </w:r>
       <w:r>
         <w:rPr>
           <w:rFonts w:ascii="Georgia" w:hAnsi="Georgia"/>
-          <w:b/>
-          <w:bCs/>
-        </w:rPr>
-        <w:t>API</w:t>
+        </w:rPr>
+        <w:t xml:space="preserve"> preparation undergoes a predictable pipeline </w:t>
       </w:r>
       <w:r>
         <w:rPr>
           <w:rFonts w:ascii="Georgia" w:hAnsi="Georgia"/>
         </w:rPr>
-        <w:t>, which exposes the data required by the frontend to represent and interact with the current state of the simulation.</w:t>
+        <w:t>that allows for error detection before stepping into the Execution phase, to ensure a correct and coherent execution by the engine</w:t>
       </w:r>
       <w:r>
         <w:rPr>
           <w:rFonts w:ascii="Georgia" w:hAnsi="Georgia"/>
         </w:rPr>
+        <w:t>.</w:t>
+      </w:r>
+    </w:p>
+    <w:p>
+      <w:pPr>
+        <w:ind w:firstLine="720"/>
+        <w:rPr>
+          <w:rFonts w:ascii="Georgia" w:hAnsi="Georgia"/>
+        </w:rPr>
+      </w:pPr>
+      <w:r>
+        <w:rPr>
+          <w:rFonts w:ascii="Georgia" w:hAnsi="Georgia"/>
+        </w:rPr>
+        <w:t xml:space="preserve">Mainly, the presentation layer </w:t>
+      </w:r>
+      <w:r>
+        <w:rPr>
+          <w:rFonts w:ascii="Georgia" w:hAnsi="Georgia"/>
+        </w:rPr>
+        <w:t xml:space="preserve">wraps the machine type, alphabet, instructions and different parameters specific to </w:t>
+      </w:r>
+      <w:r>
+        <w:rPr>
+          <w:rFonts w:ascii="Georgia" w:hAnsi="Georgia"/>
+        </w:rPr>
+        <w:t xml:space="preserve">machines into config objects, then passes it to the </w:t>
+      </w:r>
+      <w:r>
+        <w:rPr>
+          <w:rFonts w:ascii="Georgia" w:hAnsi="Georgia"/>
+        </w:rPr>
+        <w:t>“</w:t>
+      </w:r>
+      <w:proofErr w:type="spellStart"/>
+      <w:r>
+        <w:rPr>
+          <w:rFonts w:ascii="Georgia" w:hAnsi="Georgia"/>
+        </w:rPr>
+        <w:t>ParsingManager</w:t>
+      </w:r>
+      <w:proofErr w:type="spellEnd"/>
+      <w:r>
+        <w:rPr>
+          <w:rFonts w:ascii="Georgia" w:hAnsi="Georgia"/>
+        </w:rPr>
+        <w:t>”</w:t>
+      </w:r>
+      <w:r>
+        <w:rPr>
+          <w:rFonts w:ascii="Georgia" w:hAnsi="Georgia"/>
+        </w:rPr>
+        <w:t xml:space="preserve"> which detects the </w:t>
+      </w:r>
+      <w:r>
+        <w:rPr>
+          <w:rFonts w:ascii="Georgia" w:hAnsi="Georgia"/>
+        </w:rPr>
+        <w:t>machine type and forwards the configuration to the concerned parser. As shown in the figure below.</w:t>
+      </w:r>
+    </w:p>
+    <w:p>
+      <w:pPr>
+        <w:ind w:firstLine="720"/>
+        <w:rPr>
+          <w:rFonts w:ascii="Georgia" w:hAnsi="Georgia"/>
+        </w:rPr>
+      </w:pPr>
+      <w:r>
+        <w:rPr>
+          <w:rFonts w:ascii="Georgia" w:hAnsi="Georgia"/>
+        </w:rPr>
+        <w:t>“</w:t>
+      </w:r>
+      <w:proofErr w:type="spellStart"/>
+      <w:r>
+        <w:rPr>
+          <w:rFonts w:ascii="Georgia" w:hAnsi="Georgia"/>
+        </w:rPr>
+        <w:t>ExecutionManager</w:t>
+      </w:r>
+      <w:proofErr w:type="spellEnd"/>
+      <w:r>
+        <w:rPr>
+          <w:rFonts w:ascii="Georgia" w:hAnsi="Georgia"/>
+        </w:rPr>
+        <w:t>”</w:t>
+      </w:r>
+      <w:r>
+        <w:rPr>
+          <w:rFonts w:ascii="Georgia" w:hAnsi="Georgia"/>
+        </w:rPr>
+        <w:t xml:space="preserve"> is the unit responsible for controlling th</w:t>
+      </w:r>
+      <w:r>
+        <w:rPr>
+          <w:rFonts w:ascii="Georgia" w:hAnsi="Georgia"/>
+        </w:rPr>
+        <w:t>e behaviour of the core engine…</w:t>
+      </w:r>
+    </w:p>
+    <w:p>
+      <w:pPr>
+        <w:pStyle w:val="Heading3"/>
+        <w:rPr>
+          <w:b/>
+          <w:bCs/>
+        </w:rPr>
+      </w:pPr>
+      <w:bookmarkStart w:id="21" w:name="_Toc240246366"/>
+      <w:r>
+        <w:rPr>
+          <w:b/>
+          <w:bCs/>
+        </w:rPr>
+        <w:t>Communication between the Engine and the frontend</w:t>
+      </w:r>
+      <w:bookmarkEnd w:id="21"/>
+    </w:p>
+    <w:p>
+      <w:pPr>
+        <w:ind w:firstLine="720"/>
+      </w:pPr>
+      <w:bookmarkStart w:id="22" w:name="_Toc240246367"/>
+      <w:r>
+        <w:t>The communication between the execution engine and the frontend represents a critical architectural boundary within the simulator. Because the tool handles both deterministic models and complex non-deterministic automata (such as NFAs, PDAs, LBAs, and Turing Machines) with simultaneous execution branches, the bridge between the React UI and the core TypeScript execution loops must strictly govern state observability, request lifecycles, and asynchronous updates.</w:t>
+      </w:r>
+    </w:p>
+    <w:p>
+      <w:pPr>
+        <w:ind w:firstLine="720"/>
+      </w:pPr>
+      <w:r>
+        <w:t>To achieve this, the system implements a specialized engine API mediated through custom React hooks (Automata Hook) and orchestration managers (</w:t>
+      </w:r>
+      <w:proofErr w:type="spellStart"/>
+      <w:r>
+        <w:t>Engine.ts</w:t>
+      </w:r>
+      <w:proofErr w:type="spellEnd"/>
+      <w:r>
+        <w:t xml:space="preserve">, </w:t>
+      </w:r>
+      <w:proofErr w:type="spellStart"/>
+      <w:r>
+        <w:t>InstanceManager.ts</w:t>
+      </w:r>
+      <w:proofErr w:type="spellEnd"/>
+      <w:r>
+        <w:t>). This API establishes a clear contract:</w:t>
+      </w:r>
+    </w:p>
+    <w:p>
+      <w:pPr>
+        <w:pStyle w:val="ListParagraph"/>
+        <w:numPr>
+          <w:ilvl w:val="0"/>
+          <w:numId w:val="8"/>
+        </w:numPr>
+      </w:pPr>
+      <w:r>
+        <w:rPr>
+          <w:b/>
+          <w:bCs/>
+        </w:rPr>
+        <w:t>Request &amp; Control Flow:</w:t>
+      </w:r>
+      <w:r>
+        <w:t xml:space="preserve"> The frontend dispatches user-driven intents—such as parsing DSL code via the </w:t>
+      </w:r>
+      <w:proofErr w:type="spellStart"/>
+      <w:r>
+        <w:t>ParsingManager</w:t>
+      </w:r>
+      <w:proofErr w:type="spellEnd"/>
+      <w:r>
+        <w:t>, initiating execution steps, or applying tape/stack alterations (</w:t>
+      </w:r>
+      <w:proofErr w:type="spellStart"/>
+      <w:r>
+        <w:t>applyChanges.ts</w:t>
+      </w:r>
+      <w:proofErr w:type="spellEnd"/>
+      <w:r>
+        <w:t>)—down to the orchestration layer.</w:t>
+      </w:r>
+    </w:p>
+    <w:p>
+      <w:pPr>
+        <w:pStyle w:val="ListParagraph"/>
+        <w:numPr>
+          <w:ilvl w:val="0"/>
+          <w:numId w:val="8"/>
+        </w:numPr>
+      </w:pPr>
+      <w:r>
+        <w:rPr>
+          <w:b/>
+          <w:bCs/>
+        </w:rPr>
+        <w:t>Observability &amp; State Dispatch:</w:t>
+      </w:r>
+      <w:r>
+        <w:t xml:space="preserve"> Conversely, the engine exposes controlled state snapshots to the UI layers (</w:t>
+      </w:r>
+      <w:proofErr w:type="spellStart"/>
+      <w:r>
+        <w:t>ExecSpace.ts</w:t>
+      </w:r>
+      <w:proofErr w:type="spellEnd"/>
+      <w:r>
+        <w:t>, graph visualizers, and tape/stack views). Rather than allowing arbitrary direct mutations, the engine yields structured execution states and branch results that the frontend uses to render real-time transitions, highlight active states, and track step completion (</w:t>
+      </w:r>
+      <w:proofErr w:type="spellStart"/>
+      <w:r>
+        <w:t>computeEOI.ts</w:t>
+      </w:r>
+      <w:proofErr w:type="spellEnd"/>
+      <w:r>
+        <w:t>).</w:t>
+      </w:r>
+    </w:p>
+    <w:p>
+      <w:pPr>
+        <w:pStyle w:val="ListParagraph"/>
+        <w:numPr>
+          <w:ilvl w:val="0"/>
+          <w:numId w:val="8"/>
+        </w:numPr>
+      </w:pPr>
+      <w:r>
+        <w:rPr>
+          <w:b/>
+          <w:bCs/>
+        </w:rPr>
+        <w:t>History &amp; Replay Management:</w:t>
+      </w:r>
+      <w:r>
+        <w:t xml:space="preserve"> The communication layer hooks directly into the </w:t>
+      </w:r>
+      <w:proofErr w:type="spellStart"/>
+      <w:r>
+        <w:t>HistoryManager</w:t>
+      </w:r>
+      <w:proofErr w:type="spellEnd"/>
+      <w:r>
+        <w:t>, allowing the frontend to request historical snapshots, step backward/forward, or inspect previous execution states without re-running the underlying machine logic.</w:t>
+      </w:r>
+    </w:p>
+    <w:p>
+      <w:pPr>
+        <w:ind w:firstLine="720"/>
+      </w:pPr>
+    </w:p>
+    <w:p/>
+    <w:p>
+      <w:pPr>
+        <w:pStyle w:val="Heading3"/>
+        <w:rPr>
+          <w:b/>
+          <w:bCs/>
+        </w:rPr>
+      </w:pPr>
+      <w:r>
+        <w:rPr>
+          <w:b/>
+          <w:bCs/>
+        </w:rPr>
+        <w:t>Data representation and performance</w:t>
+      </w:r>
+      <w:bookmarkEnd w:id="22"/>
+    </w:p>
+    <w:p>
+      <w:pPr>
+        <w:ind w:firstLine="720"/>
+      </w:pPr>
+      <w:r>
+        <w:t>Designing an interactive simulator for formal language models requires high-frequency state updates, particularly when animating graph traversals or handling massive non-deterministic branching trees. To ensure smooth 60fps UI rendering and prevent execution lag during complex state expansions, the data representation strategy prioritizes memory efficiency and CPU cache locality:</w:t>
+      </w:r>
+    </w:p>
+    <w:p>
+      <w:pPr>
+        <w:pStyle w:val="ListParagraph"/>
+        <w:numPr>
+          <w:ilvl w:val="0"/>
+          <w:numId w:val="9"/>
+        </w:numPr>
+      </w:pPr>
+      <w:r>
+        <w:rPr>
+          <w:b/>
+          <w:bCs/>
+        </w:rPr>
+        <w:t>Structure of Arrays (</w:t>
+      </w:r>
+      <w:proofErr w:type="spellStart"/>
+      <w:r>
+        <w:rPr>
+          <w:b/>
+          <w:bCs/>
+        </w:rPr>
+        <w:t>SoA</w:t>
+      </w:r>
+      <w:proofErr w:type="spellEnd"/>
+      <w:r>
+        <w:rPr>
+          <w:b/>
+          <w:bCs/>
+        </w:rPr>
+        <w:t>) Layout:</w:t>
+      </w:r>
+      <w:r>
+        <w:t xml:space="preserve"> To optimize memory access patterns and hardware cache locality during concurrent state execution, core data structures are organized using a Structure of Arrays layout in TypeScript rather than traditional fragmented object graphs. This keeps tightly coupled simulation metrics contiguous in memory, drastically reducing cache misses during heavy batch computations.</w:t>
+      </w:r>
+    </w:p>
+    <w:p>
+      <w:pPr>
+        <w:pStyle w:val="ListParagraph"/>
+        <w:numPr>
+          <w:ilvl w:val="0"/>
+          <w:numId w:val="9"/>
+        </w:numPr>
+      </w:pPr>
+      <w:r>
+        <w:rPr>
+          <w:b/>
+          <w:bCs/>
+        </w:rPr>
+        <w:t>Optimized Graph &amp; State Representations:</w:t>
+      </w:r>
+      <w:r>
+        <w:t xml:space="preserve"> Automata definitions (nodes, transitions, tape symbols, and stack headers) are stored in lightweight, immutable-friendly schemas that allow the </w:t>
+      </w:r>
+      <w:proofErr w:type="spellStart"/>
+      <w:r>
+        <w:t>ParsingManager</w:t>
+      </w:r>
+      <w:proofErr w:type="spellEnd"/>
+      <w:r>
+        <w:t xml:space="preserve"> and parsers (</w:t>
+      </w:r>
+      <w:proofErr w:type="spellStart"/>
+      <w:r>
+        <w:t>FSAParser.ts</w:t>
+      </w:r>
+      <w:proofErr w:type="spellEnd"/>
+      <w:r>
+        <w:t xml:space="preserve">, </w:t>
+      </w:r>
+      <w:proofErr w:type="spellStart"/>
+      <w:r>
+        <w:t>PDAParser.ts</w:t>
+      </w:r>
+      <w:proofErr w:type="spellEnd"/>
+      <w:r>
+        <w:t xml:space="preserve">, </w:t>
+      </w:r>
+      <w:proofErr w:type="spellStart"/>
+      <w:r>
+        <w:t>LBAParser.ts</w:t>
+      </w:r>
+      <w:proofErr w:type="spellEnd"/>
+      <w:r>
+        <w:t>) to quickly construct and validate formal machine definitions.</w:t>
+      </w:r>
+    </w:p>
+    <w:p>
+      <w:pPr>
+        <w:pStyle w:val="ListParagraph"/>
+        <w:numPr>
+          <w:ilvl w:val="0"/>
+          <w:numId w:val="9"/>
+        </w:numPr>
+      </w:pPr>
+      <w:r>
+        <w:rPr>
+          <w:b/>
+          <w:bCs/>
+        </w:rPr>
+        <w:t>Decoupled Rendering and Runtime:</w:t>
+      </w:r>
+      <w:r>
+        <w:t xml:space="preserve"> State updates processed by the Engine are decoupled from </w:t>
+      </w:r>
+      <w:proofErr w:type="spellStart"/>
+      <w:r>
+        <w:t>React’s</w:t>
+      </w:r>
+      <w:proofErr w:type="spellEnd"/>
+      <w:r>
+        <w:t xml:space="preserve"> virtual DOM reconciliation cycle where necessary. State modifications are buffered through optimized hooks, ensuring that high-speed execution loops and step-by-step animations remain fluid without blocking user interaction in the </w:t>
+      </w:r>
+      <w:proofErr w:type="spellStart"/>
+      <w:r>
+        <w:t>IDE.tsx</w:t>
+      </w:r>
+      <w:proofErr w:type="spellEnd"/>
+      <w:r>
+        <w:t xml:space="preserve"> or settings panels.</w:t>
+      </w:r>
+    </w:p>
+    <w:p>
+      <w:pPr>
+        <w:pStyle w:val="Heading3"/>
+        <w:rPr>
+          <w:b/>
+          <w:bCs/>
+        </w:rPr>
+      </w:pPr>
+      <w:bookmarkStart w:id="23" w:name="_Toc240246368"/>
+      <w:r>
+        <w:rPr>
+          <w:b/>
+          <w:bCs/>
+        </w:rPr>
+        <w:t>Ai</w:t>
+      </w:r>
+      <w:r>
+        <w:rPr>
+          <w:b/>
+          <w:bCs/>
+        </w:rPr>
+        <w:t xml:space="preserve"> Chatbot</w:t>
+      </w:r>
+      <w:r>
+        <w:rPr>
+          <w:b/>
+          <w:bCs/>
+        </w:rPr>
         <w:t xml:space="preserve"> </w:t>
       </w:r>
+      <w:r>
+        <w:rPr>
+          <w:b/>
+          <w:bCs/>
+        </w:rPr>
+        <w:t>integration</w:t>
+      </w:r>
+      <w:bookmarkEnd w:id="23"/>
     </w:p>
     <w:p>
       <w:pPr>
         <w:pStyle w:val="Heading3"/>
-        <w:rPr>
-          <w:b/>
-          <w:bCs/>
-        </w:rPr>
-      </w:pPr>
-      <w:bookmarkStart w:id="16" w:name="_Toc240246363"/>
-      <w:r>
-        <w:rPr>
-          <w:b/>
-          <w:bCs/>
-        </w:rPr>
-        <w:t>M19 Engine Architecture</w:t>
-      </w:r>
-      <w:bookmarkEnd w:id="16"/>
+      </w:pPr>
+    </w:p>
+    <w:p>
+      <w:pPr>
+        <w:pStyle w:val="Heading2"/>
+      </w:pPr>
+      <w:bookmarkStart w:id="24" w:name="_Toc240246369"/>
+      <w:r>
+        <w:t>Implementation</w:t>
+      </w:r>
+      <w:bookmarkEnd w:id="24"/>
     </w:p>
     <w:p>
       <w:pPr>
@@ -4024,8 +4873,30 @@
         <w:rPr>
           <w:rFonts w:ascii="Georgia" w:hAnsi="Georgia"/>
         </w:rPr>
-        <w:t>The M19 engine had to be both performant and flexible. To achieve this, we decided to adopt a Structure of Arrays (SoA) approach for data management within the engine. This approach has been shown to provide improved cache locality for certain workloads, reducing the frequency of cache misses and, consequently, the time spent waiting for data to be retrieved from main memory. [Citation]</w:t>
-      </w:r>
+        <w:t>The implementation followed a</w:t>
+      </w:r>
+      <w:r>
+        <w:rPr>
+          <w:rFonts w:ascii="Georgia" w:hAnsi="Georgia"/>
+        </w:rPr>
+        <w:t xml:space="preserve">n iterative approach in a way that allowed integrating more functionalities over the time, the </w:t>
+      </w:r>
+      <w:r>
+        <w:rPr>
+          <w:rFonts w:ascii="Georgia" w:hAnsi="Georgia"/>
+        </w:rPr>
+        <w:t>overall schedule is illustrated in the following Gantt Diagram.</w:t>
+      </w:r>
+    </w:p>
+    <w:p>
+      <w:pPr>
+        <w:pStyle w:val="Heading2"/>
+      </w:pPr>
+      <w:bookmarkStart w:id="25" w:name="_Toc240246370"/>
+      <w:r>
+        <w:t>Used Tools and Languages</w:t>
+      </w:r>
+      <w:bookmarkEnd w:id="25"/>
     </w:p>
     <w:p>
       <w:pPr>
@@ -4038,458 +4909,473 @@
         <w:rPr>
           <w:rFonts w:ascii="Georgia" w:hAnsi="Georgia"/>
         </w:rPr>
+        <w:t xml:space="preserve">The automata simulator is implemented as a client-side single-page application using </w:t>
+      </w:r>
+      <w:r>
+        <w:rPr>
+          <w:rFonts w:ascii="Georgia" w:hAnsi="Georgia"/>
+          <w:b/>
+          <w:bCs/>
+        </w:rPr>
+        <w:t>TypeScript</w:t>
+      </w:r>
+      <w:r>
+        <w:rPr>
+          <w:rFonts w:ascii="Georgia" w:hAnsi="Georgia"/>
+        </w:rPr>
+        <w:t xml:space="preserve">, </w:t>
+      </w:r>
+      <w:r>
+        <w:rPr>
+          <w:rFonts w:ascii="Georgia" w:hAnsi="Georgia"/>
+          <w:b/>
+          <w:bCs/>
+        </w:rPr>
+        <w:t>React</w:t>
+      </w:r>
+      <w:r>
+        <w:rPr>
+          <w:rFonts w:ascii="Georgia" w:hAnsi="Georgia"/>
+        </w:rPr>
+        <w:t xml:space="preserve">, </w:t>
+      </w:r>
+      <w:r>
+        <w:rPr>
+          <w:rFonts w:ascii="Georgia" w:hAnsi="Georgia"/>
+          <w:b/>
+          <w:bCs/>
+        </w:rPr>
+        <w:t>Tailwind CSS</w:t>
+      </w:r>
+      <w:r>
+        <w:rPr>
+          <w:rFonts w:ascii="Georgia" w:hAnsi="Georgia"/>
+        </w:rPr>
+        <w:t xml:space="preserve">, and </w:t>
+      </w:r>
+      <w:r>
+        <w:rPr>
+          <w:rFonts w:ascii="Georgia" w:hAnsi="Georgia"/>
+          <w:b/>
+          <w:bCs/>
+        </w:rPr>
+        <w:t>custom SVG graphics</w:t>
+      </w:r>
+      <w:r>
+        <w:rPr>
+          <w:rFonts w:ascii="Georgia" w:hAnsi="Georgia"/>
+        </w:rPr>
+        <w:t xml:space="preserve">. The codebase is structured around a modular architecture that separates </w:t>
+      </w:r>
+      <w:r>
+        <w:rPr>
+          <w:rFonts w:ascii="Georgia" w:hAnsi="Georgia"/>
+        </w:rPr>
         <w:lastRenderedPageBreak/>
-        <w:t>Beyond its performance characteristics, this representation also supports the management of multiple machine instances simultaneously. This is particularly important for handling nondeterministic machines, where a single execution step may result in multiple possible states that must be processed concurrently.</w:t>
-      </w:r>
-    </w:p>
-    <w:p>
-      <w:pPr>
-        <w:ind w:firstLine="720"/>
+        <w:t>parsing logic, non-deterministic execution runtimes, and the interactive workspace UI.</w:t>
+      </w:r>
+    </w:p>
+    <w:p>
+      <w:pPr>
+        <w:pStyle w:val="Heading3"/>
+      </w:pPr>
+      <w:r>
+        <w:t>Parsing Engines and DSL Architecture</w:t>
+      </w:r>
+    </w:p>
+    <w:p>
+      <w:pPr>
+        <w:pStyle w:val="ListParagraph"/>
+        <w:numPr>
+          <w:ilvl w:val="0"/>
+          <w:numId w:val="12"/>
+        </w:numPr>
+      </w:pPr>
+      <w:r>
+        <w:rPr>
+          <w:b/>
+          <w:bCs/>
+        </w:rPr>
+        <w:t>Unified Parsing Manager (</w:t>
+      </w:r>
+      <w:proofErr w:type="spellStart"/>
+      <w:r>
+        <w:rPr>
+          <w:b/>
+          <w:bCs/>
+        </w:rPr>
+        <w:t>ParsingManager.ts</w:t>
+      </w:r>
+      <w:proofErr w:type="spellEnd"/>
+      <w:r>
+        <w:rPr>
+          <w:b/>
+          <w:bCs/>
+        </w:rPr>
+        <w:t>):</w:t>
+      </w:r>
+      <w:r>
+        <w:t xml:space="preserve"> Serves as the primary entry point for user-authored text, routing input code to specialized parsers depending on the selected theoretical computing model.</w:t>
+      </w:r>
+    </w:p>
+    <w:p>
+      <w:pPr>
+        <w:pStyle w:val="ListParagraph"/>
+        <w:numPr>
+          <w:ilvl w:val="0"/>
+          <w:numId w:val="12"/>
+        </w:numPr>
+      </w:pPr>
+      <w:r>
+        <w:rPr>
+          <w:b/>
+          <w:bCs/>
+        </w:rPr>
+        <w:t>Model-Specific Parsers:</w:t>
+      </w:r>
+      <w:r>
+        <w:t xml:space="preserve"> Specialized parsers (</w:t>
+      </w:r>
+      <w:proofErr w:type="spellStart"/>
+      <w:r>
+        <w:t>FSAParser.ts</w:t>
+      </w:r>
+      <w:proofErr w:type="spellEnd"/>
+      <w:r>
+        <w:t xml:space="preserve">, </w:t>
+      </w:r>
+      <w:proofErr w:type="spellStart"/>
+      <w:r>
+        <w:t>PDAParser.ts</w:t>
+      </w:r>
+      <w:proofErr w:type="spellEnd"/>
+      <w:r>
+        <w:t xml:space="preserve">, </w:t>
+      </w:r>
+      <w:proofErr w:type="spellStart"/>
+      <w:r>
+        <w:t>LBAParser.ts</w:t>
+      </w:r>
+      <w:proofErr w:type="spellEnd"/>
+      <w:r>
+        <w:t>, and Turing Machine parsers) tokenize and validate custom Domain-Specific Language (DSL) scripts, converting plain text rules into robust internal formal machine representations.</w:t>
+      </w:r>
+    </w:p>
+    <w:p>
+      <w:pPr>
+        <w:pStyle w:val="ListParagraph"/>
+        <w:numPr>
+          <w:ilvl w:val="0"/>
+          <w:numId w:val="12"/>
+        </w:numPr>
+      </w:pPr>
+      <w:r>
+        <w:rPr>
+          <w:b/>
+          <w:bCs/>
+        </w:rPr>
+        <w:t>Code Cleaning and Error Handling:</w:t>
+      </w:r>
+      <w:r>
+        <w:t xml:space="preserve"> Auxiliary cleaning services (</w:t>
+      </w:r>
+      <w:proofErr w:type="spellStart"/>
+      <w:r>
+        <w:t>CleaningService.ts</w:t>
+      </w:r>
+      <w:proofErr w:type="spellEnd"/>
+      <w:r>
+        <w:t xml:space="preserve">) strip comments, normalize whitespace, and provide syntax validation feedback directly back to the </w:t>
+      </w:r>
+      <w:proofErr w:type="spellStart"/>
+      <w:r>
+        <w:t>IDE.tsx</w:t>
+      </w:r>
+      <w:proofErr w:type="spellEnd"/>
+      <w:r>
+        <w:t xml:space="preserve"> editor component.</w:t>
+      </w:r>
+    </w:p>
+    <w:p>
+      <w:pPr>
+        <w:pStyle w:val="Heading3"/>
+      </w:pPr>
+      <w:r>
+        <w:t>Execution Runtime and Instance Management</w:t>
+      </w:r>
+    </w:p>
+    <w:p>
+      <w:pPr>
+        <w:pStyle w:val="ListParagraph"/>
+        <w:numPr>
+          <w:ilvl w:val="0"/>
+          <w:numId w:val="14"/>
+        </w:numPr>
+      </w:pPr>
+      <w:r>
+        <w:rPr>
+          <w:b/>
+          <w:bCs/>
+        </w:rPr>
+        <w:t>Orchestration Hooks (Automata Hook):</w:t>
+      </w:r>
+      <w:r>
+        <w:t xml:space="preserve"> Custom React hooks encapsulate the core execution lifecycle, coordinating step-by-step evaluation, branch state changes, and completion checks.</w:t>
+      </w:r>
+    </w:p>
+    <w:p>
+      <w:pPr>
+        <w:pStyle w:val="ListParagraph"/>
+        <w:numPr>
+          <w:ilvl w:val="0"/>
+          <w:numId w:val="14"/>
+        </w:numPr>
+      </w:pPr>
+      <w:r>
+        <w:rPr>
+          <w:b/>
+          <w:bCs/>
+        </w:rPr>
+        <w:t>Non-Deterministic Branching (</w:t>
+      </w:r>
+      <w:proofErr w:type="spellStart"/>
+      <w:r>
+        <w:rPr>
+          <w:b/>
+          <w:bCs/>
+        </w:rPr>
+        <w:t>InstanceManager.ts</w:t>
+      </w:r>
+      <w:proofErr w:type="spellEnd"/>
+      <w:r>
+        <w:rPr>
+          <w:b/>
+          <w:bCs/>
+        </w:rPr>
+        <w:t>):</w:t>
+      </w:r>
+      <w:r>
+        <w:t xml:space="preserve"> Manages concurrent execution paths for non-deterministic machines, assigning unique instance IDs to track parallel evaluation branches without freezing the main thread.</w:t>
+      </w:r>
+    </w:p>
+    <w:p>
+      <w:pPr>
+        <w:pStyle w:val="ListParagraph"/>
+        <w:numPr>
+          <w:ilvl w:val="0"/>
+          <w:numId w:val="14"/>
+        </w:numPr>
+      </w:pPr>
+      <w:r>
+        <w:rPr>
+          <w:b/>
+          <w:bCs/>
+        </w:rPr>
+        <w:t>State Transition Engine (</w:t>
+      </w:r>
+      <w:proofErr w:type="spellStart"/>
+      <w:r>
+        <w:rPr>
+          <w:b/>
+          <w:bCs/>
+        </w:rPr>
+        <w:t>Engine.ts</w:t>
+      </w:r>
+      <w:proofErr w:type="spellEnd"/>
+      <w:r>
+        <w:rPr>
+          <w:b/>
+          <w:bCs/>
+        </w:rPr>
+        <w:t>):</w:t>
+      </w:r>
+      <w:r>
+        <w:t xml:space="preserve"> Evaluates active machine states against current tape heads, stack frames, and transition rules, applying updates via dedicated modifiers (</w:t>
+      </w:r>
+      <w:proofErr w:type="spellStart"/>
+      <w:r>
+        <w:t>applyChanges.ts</w:t>
+      </w:r>
+      <w:proofErr w:type="spellEnd"/>
+      <w:r>
+        <w:t xml:space="preserve">, </w:t>
+      </w:r>
+      <w:proofErr w:type="spellStart"/>
+      <w:r>
+        <w:t>computeEOI.ts</w:t>
+      </w:r>
+      <w:proofErr w:type="spellEnd"/>
+      <w:r>
+        <w:t>).</w:t>
+      </w:r>
+    </w:p>
+    <w:p>
+      <w:pPr>
+        <w:pStyle w:val="Heading3"/>
+      </w:pPr>
+      <w:r>
+        <w:t>Frontend Workspace and Visualization</w:t>
+      </w:r>
+    </w:p>
+    <w:p>
+      <w:pPr>
+        <w:pStyle w:val="ListParagraph"/>
+        <w:numPr>
+          <w:ilvl w:val="0"/>
+          <w:numId w:val="16"/>
+        </w:numPr>
+      </w:pPr>
+      <w:r>
+        <w:rPr>
+          <w:b/>
+          <w:bCs/>
+        </w:rPr>
+        <w:t>Application Shell (</w:t>
+      </w:r>
+      <w:proofErr w:type="spellStart"/>
+      <w:r>
+        <w:rPr>
+          <w:b/>
+          <w:bCs/>
+        </w:rPr>
+        <w:t>App.tsx</w:t>
+      </w:r>
+      <w:proofErr w:type="spellEnd"/>
+      <w:r>
+        <w:rPr>
+          <w:b/>
+          <w:bCs/>
+        </w:rPr>
+        <w:t>):</w:t>
+      </w:r>
+      <w:r>
+        <w:t xml:space="preserve"> Coordinates global state distribution, passing tape states, stack frames, and model configurations down to specialized visual components.</w:t>
+      </w:r>
+    </w:p>
+    <w:p>
+      <w:pPr>
+        <w:pStyle w:val="ListParagraph"/>
+        <w:numPr>
+          <w:ilvl w:val="0"/>
+          <w:numId w:val="16"/>
+        </w:numPr>
+      </w:pPr>
+      <w:r>
+        <w:rPr>
+          <w:b/>
+          <w:bCs/>
+        </w:rPr>
+        <w:t>Interactive Visualizers:</w:t>
+      </w:r>
+      <w:r>
+        <w:t xml:space="preserve"> Real-time graph renderers (</w:t>
+      </w:r>
+      <w:proofErr w:type="spellStart"/>
+      <w:r>
+        <w:t>FSAGraph.tsx</w:t>
+      </w:r>
+      <w:proofErr w:type="spellEnd"/>
+      <w:r>
+        <w:t xml:space="preserve">, </w:t>
+      </w:r>
+      <w:proofErr w:type="spellStart"/>
+      <w:r>
+        <w:t>LBAGraph.tsx</w:t>
+      </w:r>
+      <w:proofErr w:type="spellEnd"/>
+      <w:r>
+        <w:t>) leverage SVG graphics to dynamically display node transitions, active states, and machine configurations.</w:t>
+      </w:r>
+    </w:p>
+    <w:p>
+      <w:pPr>
+        <w:pStyle w:val="ListParagraph"/>
+        <w:numPr>
+          <w:ilvl w:val="0"/>
+          <w:numId w:val="16"/>
+        </w:numPr>
+      </w:pPr>
+      <w:r>
+        <w:rPr>
+          <w:b/>
+          <w:bCs/>
+        </w:rPr>
+        <w:t>Inspection Panels:</w:t>
+      </w:r>
+      <w:r>
+        <w:t xml:space="preserve"> Dedicated views—including the Tape View, Stack View, and History Manager (</w:t>
+      </w:r>
+      <w:proofErr w:type="spellStart"/>
+      <w:r>
+        <w:t>HistoryManager.ts</w:t>
+      </w:r>
+      <w:proofErr w:type="spellEnd"/>
+      <w:r>
+        <w:t>)—allow users to step forward and backward through execution history, inspect past states, and export graphical outputs.</w:t>
+      </w:r>
+    </w:p>
+    <w:p>
+      <w:pPr>
+        <w:pStyle w:val="ListParagraph"/>
+        <w:numPr>
+          <w:ilvl w:val="0"/>
+          <w:numId w:val="16"/>
+        </w:numPr>
+      </w:pPr>
+      <w:r>
+        <w:rPr>
+          <w:b/>
+          <w:bCs/>
+        </w:rPr>
+        <w:lastRenderedPageBreak/>
+        <w:t>Persistence &amp; Settings:</w:t>
+      </w:r>
+      <w:r>
+        <w:t xml:space="preserve"> User preferences and workspace configurations are managed via a Settings Modal (</w:t>
+      </w:r>
+      <w:proofErr w:type="spellStart"/>
+      <w:r>
+        <w:t>SettingsModal.tsx</w:t>
+      </w:r>
+      <w:proofErr w:type="spellEnd"/>
+      <w:r>
+        <w:t>) and persisted using browser storage.</w:t>
+      </w:r>
+    </w:p>
+    <w:p>
+      <w:pPr>
         <w:rPr>
           <w:rFonts w:ascii="Georgia" w:hAnsi="Georgia"/>
         </w:rPr>
       </w:pPr>
-      <w:r>
-        <w:rPr>
-          <w:rFonts w:ascii="Georgia" w:hAnsi="Georgia"/>
-        </w:rPr>
-        <w:t>The execution loop is then configured at instantiation time through the engine's constructor, effectively determining the execution strategy of a given engine instance before the simulation begins. The following class diagram details the internal architecture of the M19 engine and illustrates the relationships between its main components.</w:t>
-      </w:r>
-    </w:p>
-    <w:p>
-      <w:pPr>
-        <w:pStyle w:val="Heading3"/>
-        <w:rPr>
-          <w:b/>
-          <w:bCs/>
-        </w:rPr>
-      </w:pPr>
-      <w:bookmarkStart w:id="17" w:name="_Toc240246364"/>
-      <w:r>
-        <w:rPr>
-          <w:b/>
-          <w:bCs/>
-        </w:rPr>
-        <w:t>Included Algorithms</w:t>
-      </w:r>
-      <w:bookmarkEnd w:id="17"/>
-    </w:p>
-    <w:p>
-      <w:pPr>
-        <w:pStyle w:val="Heading3"/>
-        <w:rPr>
-          <w:b/>
-          <w:bCs/>
-        </w:rPr>
-      </w:pPr>
-      <w:bookmarkStart w:id="18" w:name="_Toc240246365"/>
-      <w:r>
-        <w:rPr>
-          <w:b/>
-          <w:bCs/>
-        </w:rPr>
-        <w:t>Parsing and Execution Control</w:t>
-      </w:r>
-      <w:bookmarkEnd w:id="18"/>
-    </w:p>
-    <w:p>
-      <w:pPr>
-        <w:ind w:firstLine="720"/>
-        <w:rPr>
-          <w:rFonts w:ascii="Georgia" w:hAnsi="Georgia"/>
-        </w:rPr>
-      </w:pPr>
-      <w:r>
-        <w:rPr>
-          <w:rFonts w:ascii="Georgia" w:hAnsi="Georgia"/>
-        </w:rPr>
-        <w:t>Execution</w:t>
-      </w:r>
-      <w:r>
-        <w:rPr>
-          <w:rFonts w:ascii="Georgia" w:hAnsi="Georgia"/>
-        </w:rPr>
-        <w:t xml:space="preserve"> preparation undergoes a predictable pipeline </w:t>
-      </w:r>
-      <w:r>
-        <w:rPr>
-          <w:rFonts w:ascii="Georgia" w:hAnsi="Georgia"/>
-        </w:rPr>
-        <w:t>that allows for error detection before stepping into the Execution phase, to ensure a correct and coherent execution by the engine</w:t>
-      </w:r>
-      <w:r>
-        <w:rPr>
-          <w:rFonts w:ascii="Georgia" w:hAnsi="Georgia"/>
-        </w:rPr>
-        <w:t>.</w:t>
-      </w:r>
-    </w:p>
-    <w:p>
-      <w:pPr>
-        <w:ind w:firstLine="720"/>
-        <w:rPr>
-          <w:rFonts w:ascii="Georgia" w:hAnsi="Georgia"/>
-        </w:rPr>
-      </w:pPr>
-      <w:r>
-        <w:rPr>
-          <w:rFonts w:ascii="Georgia" w:hAnsi="Georgia"/>
-        </w:rPr>
-        <w:t xml:space="preserve">Mainly, the presentation layer </w:t>
-      </w:r>
-      <w:r>
-        <w:rPr>
-          <w:rFonts w:ascii="Georgia" w:hAnsi="Georgia"/>
-        </w:rPr>
-        <w:t xml:space="preserve">wraps the machine type, alphabet, instructions and different parameters specific to </w:t>
-      </w:r>
-      <w:r>
-        <w:rPr>
-          <w:rFonts w:ascii="Georgia" w:hAnsi="Georgia"/>
-        </w:rPr>
-        <w:t xml:space="preserve">machines into config objects, then passes it to the </w:t>
-      </w:r>
-      <w:proofErr w:type="spellStart"/>
-      <w:r>
-        <w:rPr>
-          <w:rFonts w:ascii="Georgia" w:hAnsi="Georgia"/>
-        </w:rPr>
-        <w:t>ParsingManager</w:t>
-      </w:r>
-      <w:proofErr w:type="spellEnd"/>
-      <w:r>
-        <w:rPr>
-          <w:rFonts w:ascii="Georgia" w:hAnsi="Georgia"/>
-        </w:rPr>
-        <w:t xml:space="preserve"> which detects the </w:t>
-      </w:r>
-      <w:r>
-        <w:rPr>
-          <w:rFonts w:ascii="Georgia" w:hAnsi="Georgia"/>
-        </w:rPr>
-        <w:t>machine type and forwards the configuration to the concerned parser. As shown in the figure below.</w:t>
-      </w:r>
-    </w:p>
-    <w:p>
-      <w:pPr>
-        <w:ind w:firstLine="720"/>
-        <w:rPr>
-          <w:rFonts w:ascii="Georgia" w:hAnsi="Georgia"/>
-        </w:rPr>
-      </w:pPr>
-      <w:proofErr w:type="spellStart"/>
-      <w:r>
-        <w:rPr>
-          <w:rFonts w:ascii="Georgia" w:hAnsi="Georgia"/>
-        </w:rPr>
-        <w:t>ExecutionManager</w:t>
-      </w:r>
-      <w:proofErr w:type="spellEnd"/>
-      <w:r>
-        <w:rPr>
-          <w:rFonts w:ascii="Georgia" w:hAnsi="Georgia"/>
-        </w:rPr>
-        <w:t xml:space="preserve"> is the unit responsible for controlling th</w:t>
-      </w:r>
-      <w:r>
-        <w:rPr>
-          <w:rFonts w:ascii="Georgia" w:hAnsi="Georgia"/>
-        </w:rPr>
-        <w:t>e behaviour of the core engine…</w:t>
-      </w:r>
-    </w:p>
-    <w:p>
-      <w:pPr>
-        <w:pStyle w:val="Heading3"/>
-        <w:rPr>
-          <w:b/>
-          <w:bCs/>
-        </w:rPr>
-      </w:pPr>
-      <w:bookmarkStart w:id="19" w:name="_Toc240246366"/>
-      <w:r>
-        <w:rPr>
-          <w:b/>
-          <w:bCs/>
-        </w:rPr>
-        <w:t>Communication between the Engine and the frontend</w:t>
-      </w:r>
-      <w:bookmarkEnd w:id="19"/>
-    </w:p>
-    <w:p>
-      <w:pPr>
-        <w:ind w:firstLine="720"/>
-        <w:rPr>
-          <w:rFonts w:ascii="Georgia" w:hAnsi="Georgia"/>
-        </w:rPr>
-      </w:pPr>
-      <w:r>
-        <w:rPr>
-          <w:rFonts w:ascii="Georgia" w:hAnsi="Georgia"/>
-        </w:rPr>
-        <w:t xml:space="preserve">The communication between the engine and the frontend could be the most crucial piece of the design, as it </w:t>
-      </w:r>
-      <w:r>
-        <w:rPr>
-          <w:rFonts w:ascii="Georgia" w:hAnsi="Georgia"/>
-        </w:rPr>
-        <w:t>dictates what the frontend can and cannot see, and what it can request and vice versa. For that reason, we designed a specialized engine API to handle this.</w:t>
-      </w:r>
-    </w:p>
-    <w:p>
-      <w:pPr>
-        <w:pStyle w:val="Heading3"/>
-        <w:rPr>
-          <w:b/>
-          <w:bCs/>
-        </w:rPr>
-      </w:pPr>
-      <w:bookmarkStart w:id="20" w:name="_Toc240246367"/>
-      <w:r>
-        <w:rPr>
-          <w:b/>
-          <w:bCs/>
-        </w:rPr>
-        <w:t>Data representation and performance</w:t>
-      </w:r>
-      <w:bookmarkEnd w:id="20"/>
-    </w:p>
-    <w:p>
-      <w:pPr>
-        <w:pStyle w:val="Heading3"/>
-        <w:rPr>
-          <w:b/>
-          <w:bCs/>
-          <w:lang w:val="fr-FR"/>
-        </w:rPr>
-      </w:pPr>
-      <w:bookmarkStart w:id="21" w:name="_Toc240246368"/>
-      <w:r>
-        <w:rPr>
-          <w:b/>
-          <w:bCs/>
-          <w:lang w:val="fr-FR"/>
-        </w:rPr>
-        <w:t>Ai</w:t>
-      </w:r>
-      <w:r>
-        <w:rPr>
-          <w:b/>
-          <w:bCs/>
-        </w:rPr>
-        <w:t xml:space="preserve"> Chatbot</w:t>
-      </w:r>
-      <w:r>
-        <w:rPr>
-          <w:b/>
-          <w:bCs/>
-          <w:lang w:val="fr-FR"/>
-        </w:rPr>
-        <w:t xml:space="preserve"> </w:t>
-      </w:r>
-      <w:r>
-        <w:rPr>
-          <w:b/>
-          <w:bCs/>
-        </w:rPr>
-        <w:t>integration</w:t>
-      </w:r>
-      <w:bookmarkEnd w:id="21"/>
-    </w:p>
-    <w:p>
-      <w:pPr>
-        <w:pStyle w:val="Heading3"/>
-        <w:rPr>
-          <w:lang w:val="fr-FR"/>
-        </w:rPr>
-      </w:pPr>
-    </w:p>
-    <w:p>
-      <w:pPr>
-        <w:pStyle w:val="Heading2"/>
-        <w:rPr>
-          <w:lang w:val="fr-FR"/>
-        </w:rPr>
-      </w:pPr>
-      <w:bookmarkStart w:id="22" w:name="_Toc240246369"/>
-      <w:proofErr w:type="spellStart"/>
-      <w:r>
-        <w:rPr>
-          <w:lang w:val="fr-FR"/>
-        </w:rPr>
-        <w:t>Implementation</w:t>
-      </w:r>
-      <w:bookmarkEnd w:id="22"/>
-      <w:proofErr w:type="spellEnd"/>
-    </w:p>
-    <w:p>
-      <w:pPr>
-        <w:ind w:firstLine="720"/>
-        <w:rPr>
-          <w:rFonts w:ascii="Georgia" w:hAnsi="Georgia"/>
-        </w:rPr>
-      </w:pPr>
-      <w:r>
-        <w:rPr>
-          <w:rFonts w:ascii="Georgia" w:hAnsi="Georgia"/>
-        </w:rPr>
-        <w:t>The implementation followed a</w:t>
-      </w:r>
-      <w:r>
-        <w:rPr>
-          <w:rFonts w:ascii="Georgia" w:hAnsi="Georgia"/>
-        </w:rPr>
-        <w:t xml:space="preserve">n iterative approach in a way that allowed integrating more functionalities over the time, the </w:t>
-      </w:r>
-      <w:r>
-        <w:rPr>
-          <w:rFonts w:ascii="Georgia" w:hAnsi="Georgia"/>
-        </w:rPr>
-        <w:t>overall schedule is illustrated in the following Gantt Diagram.</w:t>
-      </w:r>
-    </w:p>
-    <w:p>
-      <w:pPr>
-        <w:pStyle w:val="Heading2"/>
-      </w:pPr>
-      <w:bookmarkStart w:id="23" w:name="_Toc240246370"/>
-      <w:r>
-        <w:lastRenderedPageBreak/>
-        <w:t>Used Tools and Languages</w:t>
-      </w:r>
-      <w:bookmarkEnd w:id="23"/>
-    </w:p>
-    <w:p>
-      <w:pPr>
-        <w:ind w:firstLine="720"/>
-        <w:rPr>
-          <w:rFonts w:ascii="Georgia" w:hAnsi="Georgia"/>
-        </w:rPr>
-      </w:pPr>
-      <w:r>
-        <w:rPr>
-          <w:rFonts w:ascii="Georgia" w:hAnsi="Georgia"/>
-        </w:rPr>
-        <w:t xml:space="preserve">The code base </w:t>
-      </w:r>
-      <w:r>
-        <w:rPr>
-          <w:rFonts w:ascii="Georgia" w:hAnsi="Georgia"/>
-        </w:rPr>
-        <w:t>can be seen as a combination of a main language “TypeScript” and a fro</w:t>
-      </w:r>
-      <w:r>
-        <w:rPr>
-          <w:rFonts w:ascii="Georgia" w:hAnsi="Georgia"/>
-        </w:rPr>
-        <w:t xml:space="preserve">ntend framework “React.js”. The choice wasn’t random, but was quite careful as it was as crucial as the </w:t>
-      </w:r>
-      <w:r>
-        <w:rPr>
-          <w:rFonts w:ascii="Georgia" w:hAnsi="Georgia"/>
-        </w:rPr>
-        <w:t xml:space="preserve">system architecture, as React offers modularity, </w:t>
-      </w:r>
-      <w:r>
-        <w:rPr>
-          <w:rFonts w:ascii="Georgia" w:hAnsi="Georgia"/>
-        </w:rPr>
-        <w:t>optimized DOM management, which frees us from the hurdle of manually managing the DOM</w:t>
-      </w:r>
-      <w:r>
-        <w:rPr>
-          <w:rFonts w:ascii="Georgia" w:hAnsi="Georgia"/>
-        </w:rPr>
-        <w:t>. On the other hand, TypeScript offers the best of both worlds, it offers the speed and flexibility of JavaScript</w:t>
-      </w:r>
-      <w:r>
-        <w:rPr>
-          <w:rFonts w:ascii="Georgia" w:hAnsi="Georgia"/>
-        </w:rPr>
-        <w:t xml:space="preserve">, and the type safety of </w:t>
-      </w:r>
-      <w:r>
-        <w:rPr>
-          <w:rFonts w:ascii="Georgia" w:hAnsi="Georgia"/>
-        </w:rPr>
-        <w:t>statically typed languages</w:t>
-      </w:r>
-      <w:r>
-        <w:rPr>
-          <w:rFonts w:ascii="Georgia" w:hAnsi="Georgia"/>
-        </w:rPr>
-        <w:t>.</w:t>
-      </w:r>
-    </w:p>
-    <w:p>
-      <w:pPr>
-        <w:ind w:firstLine="720"/>
-        <w:rPr>
-          <w:rFonts w:ascii="Georgia" w:hAnsi="Georgia"/>
-        </w:rPr>
-      </w:pPr>
-      <w:r>
-        <w:rPr>
-          <w:rFonts w:ascii="Georgia" w:hAnsi="Georgia"/>
-        </w:rPr>
-        <w:t xml:space="preserve">We used visual studio code as our main code editor, Git for </w:t>
-      </w:r>
-      <w:r>
-        <w:rPr>
-          <w:rFonts w:ascii="Georgia" w:hAnsi="Georgia"/>
-        </w:rPr>
-        <w:t xml:space="preserve">version control and GitHub to host our repository. </w:t>
-      </w:r>
-      <w:r>
-        <w:rPr>
-          <w:rFonts w:ascii="Georgia" w:hAnsi="Georgia"/>
-        </w:rPr>
-        <w:t xml:space="preserve"> </w:t>
-      </w:r>
-      <w:r>
-        <w:rPr>
-          <w:rFonts w:ascii="Georgia" w:hAnsi="Georgia"/>
-        </w:rPr>
-        <w:t xml:space="preserve"> </w:t>
-      </w:r>
-    </w:p>
-    <w:p>
-      <w:pPr>
-        <w:ind w:firstLine="720"/>
-        <w:rPr>
-          <w:rFonts w:ascii="Georgia" w:hAnsi="Georgia"/>
-        </w:rPr>
-      </w:pPr>
     </w:p>
     <w:p/>
     <w:p>
       <w:pPr>
         <w:pStyle w:val="Heading1"/>
       </w:pPr>
-      <w:bookmarkStart w:id="24" w:name="_Toc240246371"/>
+      <w:bookmarkStart w:id="26" w:name="_Toc240246371"/>
       <w:r>
         <w:t>Conclusion</w:t>
       </w:r>
-      <w:bookmarkEnd w:id="24"/>
+      <w:bookmarkEnd w:id="26"/>
     </w:p>
     <w:p/>
-    <w:bookmarkStart w:id="25" w:name="_Toc240246372" w:displacedByCustomXml="next"/>
+    <w:bookmarkStart w:id="27" w:name="_Toc240246372" w:displacedByCustomXml="next"/>
     <w:sdt>
       <w:sdtPr>
+        <w:rPr>
+          <w:rFonts w:eastAsiaTheme="minorEastAsia" w:cstheme="minorBidi"/>
+          <w:b w:val="0"/>
+          <w:sz w:val="24"/>
+          <w:szCs w:val="24"/>
+        </w:rPr>
         <w:id w:val="236986194"/>
         <w:docPartObj>
           <w:docPartGallery w:val="Bibliographies"/>
           <w:docPartUnique/>
         </w:docPartObj>
       </w:sdtPr>
-      <w:sdtEndPr>
-        <w:rPr>
-          <w:rFonts w:eastAsiaTheme="minorEastAsia" w:cstheme="minorBidi"/>
-          <w:b w:val="0"/>
-          <w:sz w:val="24"/>
-          <w:szCs w:val="24"/>
-        </w:rPr>
-      </w:sdtEndPr>
       <w:sdtContent>
         <w:p>
           <w:pPr>
@@ -4498,7 +5384,7 @@
           <w:r>
             <w:t>Bibliography</w:t>
           </w:r>
-          <w:bookmarkEnd w:id="25"/>
+          <w:bookmarkEnd w:id="27"/>
         </w:p>
         <w:sdt>
           <w:sdtPr>
@@ -4656,6 +5542,155 @@
 <file path=word/numbering.xml><?xml version="1.0" encoding="utf-8"?>
 <w:numbering xmlns:wpc="http://schemas.microsoft.com/office/word/2010/wordprocessingCanvas" xmlns:cx="http://schemas.microsoft.com/office/drawing/2014/chartex" xmlns:cx1="http://schemas.microsoft.com/office/drawing/2015/9/8/chartex" xmlns:cx2="http://schemas.microsoft.com/office/drawing/2015/10/21/chartex" xmlns:cx3="http://schemas.microsoft.com/office/drawing/2016/5/9/chartex" xmlns:cx4="http://schemas.microsoft.com/office/drawing/2016/5/10/chartex" xmlns:cx5="http://schemas.microsoft.com/office/drawing/2016/5/11/chartex" xmlns:cx6="http://schemas.microsoft.com/office/drawing/2016/5/12/chartex" xmlns:cx7="http://schemas.microsoft.com/office/drawing/2016/5/13/chartex" xmlns:cx8="http://schemas.microsoft.com/office/drawing/2016/5/14/chartex" xmlns:mc="http://schemas.openxmlformats.org/markup-compatibility/2006" xmlns:aink="http://schemas.microsoft.com/office/drawing/2016/ink" xmlns:am3d="http://schemas.microsoft.com/office/drawing/2017/model3d" xmlns:o="urn:schemas-microsoft-com:office:office" xmlns:oel="http://schemas.microsoft.com/office/2019/extlst" xmlns:r="http://schemas.openxmlformats.org/officeDocument/2006/relationships" xmlns:m="http://schemas.openxmlformats.org/officeDocument/2006/math" xmlns:v="urn:schemas-microsoft-com:vml" xmlns:wp14="http://schemas.microsoft.com/office/word/2010/wordprocessingDrawing" xmlns:wp="http://schemas.openxmlformats.org/drawingml/2006/wordprocessingDrawing" xmlns:w10="urn:schemas-microsoft-com:office:word" xmlns:w="http://schemas.openxmlformats.org/wordprocessingml/2006/main" xmlns:w14="http://schemas.microsoft.com/office/word/2010/wordml" xmlns:w15="http://schemas.microsoft.com/office/word/2012/wordml" xmlns:w16cex="http://schemas.microsoft.com/office/word/2018/wordml/cex" xmlns:w16cid="http://schemas.microsoft.com/office/word/2016/wordml/cid" xmlns:w16="http://schemas.microsoft.com/office/word/2018/wordml" xmlns:w16sdtdh="http://schemas.microsoft.com/office/word/2020/wordml/sdtdatahash" xmlns:w16se="http://schemas.microsoft.com/office/word/2015/wordml/symex" xmlns:wpg="http://schemas.microsoft.com/office/word/2010/wordprocessingGroup" xmlns:wpi="http://schemas.microsoft.com/office/word/2010/wordprocessingInk" xmlns:wne="http://schemas.microsoft.com/office/word/2006/wordml" xmlns:wps="http://schemas.microsoft.com/office/word/2010/wordprocessingShape" mc:Ignorable="w14 w15 w16se w16cid w16 w16cex w16sdtdh wp14">
   <w:abstractNum w:abstractNumId="0" w15:restartNumberingAfterBreak="0">
+    <w:nsid w:val="03D8290F"/>
+    <w:multiLevelType w:val="multilevel"/>
+    <w:tmpl w:val="9DB825E2"/>
+    <w:lvl w:ilvl="0">
+      <w:start w:val="1"/>
+      <w:numFmt w:val="bullet"/>
+      <w:lvlText w:val=""/>
+      <w:lvlJc w:val="left"/>
+      <w:pPr>
+        <w:tabs>
+          <w:tab w:val="num" w:pos="720"/>
+        </w:tabs>
+        <w:ind w:left="720" w:hanging="360"/>
+      </w:pPr>
+      <w:rPr>
+        <w:rFonts w:ascii="Symbol" w:hAnsi="Symbol" w:hint="default"/>
+        <w:sz w:val="20"/>
+      </w:rPr>
+    </w:lvl>
+    <w:lvl w:ilvl="1" w:tentative="1">
+      <w:start w:val="1"/>
+      <w:numFmt w:val="bullet"/>
+      <w:lvlText w:val="o"/>
+      <w:lvlJc w:val="left"/>
+      <w:pPr>
+        <w:tabs>
+          <w:tab w:val="num" w:pos="1440"/>
+        </w:tabs>
+        <w:ind w:left="1440" w:hanging="360"/>
+      </w:pPr>
+      <w:rPr>
+        <w:rFonts w:ascii="Courier New" w:hAnsi="Courier New" w:hint="default"/>
+        <w:sz w:val="20"/>
+      </w:rPr>
+    </w:lvl>
+    <w:lvl w:ilvl="2" w:tentative="1">
+      <w:start w:val="1"/>
+      <w:numFmt w:val="bullet"/>
+      <w:lvlText w:val=""/>
+      <w:lvlJc w:val="left"/>
+      <w:pPr>
+        <w:tabs>
+          <w:tab w:val="num" w:pos="2160"/>
+        </w:tabs>
+        <w:ind w:left="2160" w:hanging="360"/>
+      </w:pPr>
+      <w:rPr>
+        <w:rFonts w:ascii="Wingdings" w:hAnsi="Wingdings" w:hint="default"/>
+        <w:sz w:val="20"/>
+      </w:rPr>
+    </w:lvl>
+    <w:lvl w:ilvl="3" w:tentative="1">
+      <w:start w:val="1"/>
+      <w:numFmt w:val="bullet"/>
+      <w:lvlText w:val=""/>
+      <w:lvlJc w:val="left"/>
+      <w:pPr>
+        <w:tabs>
+          <w:tab w:val="num" w:pos="2880"/>
+        </w:tabs>
+        <w:ind w:left="2880" w:hanging="360"/>
+      </w:pPr>
+      <w:rPr>
+        <w:rFonts w:ascii="Wingdings" w:hAnsi="Wingdings" w:hint="default"/>
+        <w:sz w:val="20"/>
+      </w:rPr>
+    </w:lvl>
+    <w:lvl w:ilvl="4" w:tentative="1">
+      <w:start w:val="1"/>
+      <w:numFmt w:val="bullet"/>
+      <w:lvlText w:val=""/>
+      <w:lvlJc w:val="left"/>
+      <w:pPr>
+        <w:tabs>
+          <w:tab w:val="num" w:pos="3600"/>
+        </w:tabs>
+        <w:ind w:left="3600" w:hanging="360"/>
+      </w:pPr>
+      <w:rPr>
+        <w:rFonts w:ascii="Wingdings" w:hAnsi="Wingdings" w:hint="default"/>
+        <w:sz w:val="20"/>
+      </w:rPr>
+    </w:lvl>
+    <w:lvl w:ilvl="5" w:tentative="1">
+      <w:start w:val="1"/>
+      <w:numFmt w:val="bullet"/>
+      <w:lvlText w:val=""/>
+      <w:lvlJc w:val="left"/>
+      <w:pPr>
+        <w:tabs>
+          <w:tab w:val="num" w:pos="4320"/>
+        </w:tabs>
+        <w:ind w:left="4320" w:hanging="360"/>
+      </w:pPr>
+      <w:rPr>
+        <w:rFonts w:ascii="Wingdings" w:hAnsi="Wingdings" w:hint="default"/>
+        <w:sz w:val="20"/>
+      </w:rPr>
+    </w:lvl>
+    <w:lvl w:ilvl="6" w:tentative="1">
+      <w:start w:val="1"/>
+      <w:numFmt w:val="bullet"/>
+      <w:lvlText w:val=""/>
+      <w:lvlJc w:val="left"/>
+      <w:pPr>
+        <w:tabs>
+          <w:tab w:val="num" w:pos="5040"/>
+        </w:tabs>
+        <w:ind w:left="5040" w:hanging="360"/>
+      </w:pPr>
+      <w:rPr>
+        <w:rFonts w:ascii="Wingdings" w:hAnsi="Wingdings" w:hint="default"/>
+        <w:sz w:val="20"/>
+      </w:rPr>
+    </w:lvl>
+    <w:lvl w:ilvl="7" w:tentative="1">
+      <w:start w:val="1"/>
+      <w:numFmt w:val="bullet"/>
+      <w:lvlText w:val=""/>
+      <w:lvlJc w:val="left"/>
+      <w:pPr>
+        <w:tabs>
+          <w:tab w:val="num" w:pos="5760"/>
+        </w:tabs>
+        <w:ind w:left="5760" w:hanging="360"/>
+      </w:pPr>
+      <w:rPr>
+        <w:rFonts w:ascii="Wingdings" w:hAnsi="Wingdings" w:hint="default"/>
+        <w:sz w:val="20"/>
+      </w:rPr>
+    </w:lvl>
+    <w:lvl w:ilvl="8" w:tentative="1">
+      <w:start w:val="1"/>
+      <w:numFmt w:val="bullet"/>
+      <w:lvlText w:val=""/>
+      <w:lvlJc w:val="left"/>
+      <w:pPr>
+        <w:tabs>
+          <w:tab w:val="num" w:pos="6480"/>
+        </w:tabs>
+        <w:ind w:left="6480" w:hanging="360"/>
+      </w:pPr>
+      <w:rPr>
+        <w:rFonts w:ascii="Wingdings" w:hAnsi="Wingdings" w:hint="default"/>
+        <w:sz w:val="20"/>
+      </w:rPr>
+    </w:lvl>
+  </w:abstractNum>
+  <w:abstractNum w:abstractNumId="1" w15:restartNumberingAfterBreak="0">
     <w:nsid w:val="116B7C2D"/>
     <w:multiLevelType w:val="hybridMultilevel"/>
     <w:tmpl w:val="4238C2DE"/>
@@ -4768,7 +5803,120 @@
       </w:rPr>
     </w:lvl>
   </w:abstractNum>
-  <w:abstractNum w:abstractNumId="1" w15:restartNumberingAfterBreak="0">
+  <w:abstractNum w:abstractNumId="2" w15:restartNumberingAfterBreak="0">
+    <w:nsid w:val="136D7F0A"/>
+    <w:multiLevelType w:val="hybridMultilevel"/>
+    <w:tmpl w:val="F30CB1B2"/>
+    <w:lvl w:ilvl="0" w:tplc="08090001">
+      <w:start w:val="1"/>
+      <w:numFmt w:val="bullet"/>
+      <w:lvlText w:val=""/>
+      <w:lvlJc w:val="left"/>
+      <w:pPr>
+        <w:ind w:left="720" w:hanging="360"/>
+      </w:pPr>
+      <w:rPr>
+        <w:rFonts w:ascii="Symbol" w:hAnsi="Symbol" w:hint="default"/>
+      </w:rPr>
+    </w:lvl>
+    <w:lvl w:ilvl="1" w:tplc="08090003" w:tentative="1">
+      <w:start w:val="1"/>
+      <w:numFmt w:val="bullet"/>
+      <w:lvlText w:val="o"/>
+      <w:lvlJc w:val="left"/>
+      <w:pPr>
+        <w:ind w:left="1440" w:hanging="360"/>
+      </w:pPr>
+      <w:rPr>
+        <w:rFonts w:ascii="Courier New" w:hAnsi="Courier New" w:cs="Courier New" w:hint="default"/>
+      </w:rPr>
+    </w:lvl>
+    <w:lvl w:ilvl="2" w:tplc="08090005" w:tentative="1">
+      <w:start w:val="1"/>
+      <w:numFmt w:val="bullet"/>
+      <w:lvlText w:val=""/>
+      <w:lvlJc w:val="left"/>
+      <w:pPr>
+        <w:ind w:left="2160" w:hanging="360"/>
+      </w:pPr>
+      <w:rPr>
+        <w:rFonts w:ascii="Wingdings" w:hAnsi="Wingdings" w:hint="default"/>
+      </w:rPr>
+    </w:lvl>
+    <w:lvl w:ilvl="3" w:tplc="08090001" w:tentative="1">
+      <w:start w:val="1"/>
+      <w:numFmt w:val="bullet"/>
+      <w:lvlText w:val=""/>
+      <w:lvlJc w:val="left"/>
+      <w:pPr>
+        <w:ind w:left="2880" w:hanging="360"/>
+      </w:pPr>
+      <w:rPr>
+        <w:rFonts w:ascii="Symbol" w:hAnsi="Symbol" w:hint="default"/>
+      </w:rPr>
+    </w:lvl>
+    <w:lvl w:ilvl="4" w:tplc="08090003" w:tentative="1">
+      <w:start w:val="1"/>
+      <w:numFmt w:val="bullet"/>
+      <w:lvlText w:val="o"/>
+      <w:lvlJc w:val="left"/>
+      <w:pPr>
+        <w:ind w:left="3600" w:hanging="360"/>
+      </w:pPr>
+      <w:rPr>
+        <w:rFonts w:ascii="Courier New" w:hAnsi="Courier New" w:cs="Courier New" w:hint="default"/>
+      </w:rPr>
+    </w:lvl>
+    <w:lvl w:ilvl="5" w:tplc="08090005" w:tentative="1">
+      <w:start w:val="1"/>
+      <w:numFmt w:val="bullet"/>
+      <w:lvlText w:val=""/>
+      <w:lvlJc w:val="left"/>
+      <w:pPr>
+        <w:ind w:left="4320" w:hanging="360"/>
+      </w:pPr>
+      <w:rPr>
+        <w:rFonts w:ascii="Wingdings" w:hAnsi="Wingdings" w:hint="default"/>
+      </w:rPr>
+    </w:lvl>
+    <w:lvl w:ilvl="6" w:tplc="08090001" w:tentative="1">
+      <w:start w:val="1"/>
+      <w:numFmt w:val="bullet"/>
+      <w:lvlText w:val=""/>
+      <w:lvlJc w:val="left"/>
+      <w:pPr>
+        <w:ind w:left="5040" w:hanging="360"/>
+      </w:pPr>
+      <w:rPr>
+        <w:rFonts w:ascii="Symbol" w:hAnsi="Symbol" w:hint="default"/>
+      </w:rPr>
+    </w:lvl>
+    <w:lvl w:ilvl="7" w:tplc="08090003" w:tentative="1">
+      <w:start w:val="1"/>
+      <w:numFmt w:val="bullet"/>
+      <w:lvlText w:val="o"/>
+      <w:lvlJc w:val="left"/>
+      <w:pPr>
+        <w:ind w:left="5760" w:hanging="360"/>
+      </w:pPr>
+      <w:rPr>
+        <w:rFonts w:ascii="Courier New" w:hAnsi="Courier New" w:cs="Courier New" w:hint="default"/>
+      </w:rPr>
+    </w:lvl>
+    <w:lvl w:ilvl="8" w:tplc="08090005" w:tentative="1">
+      <w:start w:val="1"/>
+      <w:numFmt w:val="bullet"/>
+      <w:lvlText w:val=""/>
+      <w:lvlJc w:val="left"/>
+      <w:pPr>
+        <w:ind w:left="6480" w:hanging="360"/>
+      </w:pPr>
+      <w:rPr>
+        <w:rFonts w:ascii="Wingdings" w:hAnsi="Wingdings" w:hint="default"/>
+      </w:rPr>
+    </w:lvl>
+  </w:abstractNum>
+  <w:abstractNum w:abstractNumId="3" w15:restartNumberingAfterBreak="0">
     <w:nsid w:val="21FA27F4"/>
     <w:multiLevelType w:val="hybridMultilevel"/>
     <w:tmpl w:val="CA12A60A"/>
@@ -4881,7 +6029,156 @@
       </w:rPr>
     </w:lvl>
   </w:abstractNum>
-  <w:abstractNum w:abstractNumId="2" w15:restartNumberingAfterBreak="0">
+  <w:abstractNum w:abstractNumId="4" w15:restartNumberingAfterBreak="0">
+    <w:nsid w:val="290859D2"/>
+    <w:multiLevelType w:val="multilevel"/>
+    <w:tmpl w:val="45506F40"/>
+    <w:lvl w:ilvl="0">
+      <w:start w:val="1"/>
+      <w:numFmt w:val="bullet"/>
+      <w:lvlText w:val=""/>
+      <w:lvlJc w:val="left"/>
+      <w:pPr>
+        <w:tabs>
+          <w:tab w:val="num" w:pos="720"/>
+        </w:tabs>
+        <w:ind w:left="720" w:hanging="360"/>
+      </w:pPr>
+      <w:rPr>
+        <w:rFonts w:ascii="Symbol" w:hAnsi="Symbol" w:hint="default"/>
+        <w:sz w:val="20"/>
+      </w:rPr>
+    </w:lvl>
+    <w:lvl w:ilvl="1" w:tentative="1">
+      <w:start w:val="1"/>
+      <w:numFmt w:val="bullet"/>
+      <w:lvlText w:val="o"/>
+      <w:lvlJc w:val="left"/>
+      <w:pPr>
+        <w:tabs>
+          <w:tab w:val="num" w:pos="1440"/>
+        </w:tabs>
+        <w:ind w:left="1440" w:hanging="360"/>
+      </w:pPr>
+      <w:rPr>
+        <w:rFonts w:ascii="Courier New" w:hAnsi="Courier New" w:hint="default"/>
+        <w:sz w:val="20"/>
+      </w:rPr>
+    </w:lvl>
+    <w:lvl w:ilvl="2" w:tentative="1">
+      <w:start w:val="1"/>
+      <w:numFmt w:val="bullet"/>
+      <w:lvlText w:val=""/>
+      <w:lvlJc w:val="left"/>
+      <w:pPr>
+        <w:tabs>
+          <w:tab w:val="num" w:pos="2160"/>
+        </w:tabs>
+        <w:ind w:left="2160" w:hanging="360"/>
+      </w:pPr>
+      <w:rPr>
+        <w:rFonts w:ascii="Wingdings" w:hAnsi="Wingdings" w:hint="default"/>
+        <w:sz w:val="20"/>
+      </w:rPr>
+    </w:lvl>
+    <w:lvl w:ilvl="3" w:tentative="1">
+      <w:start w:val="1"/>
+      <w:numFmt w:val="bullet"/>
+      <w:lvlText w:val=""/>
+      <w:lvlJc w:val="left"/>
+      <w:pPr>
+        <w:tabs>
+          <w:tab w:val="num" w:pos="2880"/>
+        </w:tabs>
+        <w:ind w:left="2880" w:hanging="360"/>
+      </w:pPr>
+      <w:rPr>
+        <w:rFonts w:ascii="Wingdings" w:hAnsi="Wingdings" w:hint="default"/>
+        <w:sz w:val="20"/>
+      </w:rPr>
+    </w:lvl>
+    <w:lvl w:ilvl="4" w:tentative="1">
+      <w:start w:val="1"/>
+      <w:numFmt w:val="bullet"/>
+      <w:lvlText w:val=""/>
+      <w:lvlJc w:val="left"/>
+      <w:pPr>
+        <w:tabs>
+          <w:tab w:val="num" w:pos="3600"/>
+        </w:tabs>
+        <w:ind w:left="3600" w:hanging="360"/>
+      </w:pPr>
+      <w:rPr>
+        <w:rFonts w:ascii="Wingdings" w:hAnsi="Wingdings" w:hint="default"/>
+        <w:sz w:val="20"/>
+      </w:rPr>
+    </w:lvl>
+    <w:lvl w:ilvl="5" w:tentative="1">
+      <w:start w:val="1"/>
+      <w:numFmt w:val="bullet"/>
+      <w:lvlText w:val=""/>
+      <w:lvlJc w:val="left"/>
+      <w:pPr>
+        <w:tabs>
+          <w:tab w:val="num" w:pos="4320"/>
+        </w:tabs>
+        <w:ind w:left="4320" w:hanging="360"/>
+      </w:pPr>
+      <w:rPr>
+        <w:rFonts w:ascii="Wingdings" w:hAnsi="Wingdings" w:hint="default"/>
+        <w:sz w:val="20"/>
+      </w:rPr>
+    </w:lvl>
+    <w:lvl w:ilvl="6" w:tentative="1">
+      <w:start w:val="1"/>
+      <w:numFmt w:val="bullet"/>
+      <w:lvlText w:val=""/>
+      <w:lvlJc w:val="left"/>
+      <w:pPr>
+        <w:tabs>
+          <w:tab w:val="num" w:pos="5040"/>
+        </w:tabs>
+        <w:ind w:left="5040" w:hanging="360"/>
+      </w:pPr>
+      <w:rPr>
+        <w:rFonts w:ascii="Wingdings" w:hAnsi="Wingdings" w:hint="default"/>
+        <w:sz w:val="20"/>
+      </w:rPr>
+    </w:lvl>
+    <w:lvl w:ilvl="7" w:tentative="1">
+      <w:start w:val="1"/>
+      <w:numFmt w:val="bullet"/>
+      <w:lvlText w:val=""/>
+      <w:lvlJc w:val="left"/>
+      <w:pPr>
+        <w:tabs>
+          <w:tab w:val="num" w:pos="5760"/>
+        </w:tabs>
+        <w:ind w:left="5760" w:hanging="360"/>
+      </w:pPr>
+      <w:rPr>
+        <w:rFonts w:ascii="Wingdings" w:hAnsi="Wingdings" w:hint="default"/>
+        <w:sz w:val="20"/>
+      </w:rPr>
+    </w:lvl>
+    <w:lvl w:ilvl="8" w:tentative="1">
+      <w:start w:val="1"/>
+      <w:numFmt w:val="bullet"/>
+      <w:lvlText w:val=""/>
+      <w:lvlJc w:val="left"/>
+      <w:pPr>
+        <w:tabs>
+          <w:tab w:val="num" w:pos="6480"/>
+        </w:tabs>
+        <w:ind w:left="6480" w:hanging="360"/>
+      </w:pPr>
+      <w:rPr>
+        <w:rFonts w:ascii="Wingdings" w:hAnsi="Wingdings" w:hint="default"/>
+        <w:sz w:val="20"/>
+      </w:rPr>
+    </w:lvl>
+  </w:abstractNum>
+  <w:abstractNum w:abstractNumId="5" w15:restartNumberingAfterBreak="0">
     <w:nsid w:val="2C2B2747"/>
     <w:multiLevelType w:val="multilevel"/>
     <w:tmpl w:val="2C3A2BE2"/>
@@ -5030,7 +6327,7 @@
       </w:rPr>
     </w:lvl>
   </w:abstractNum>
-  <w:abstractNum w:abstractNumId="3" w15:restartNumberingAfterBreak="0">
+  <w:abstractNum w:abstractNumId="6" w15:restartNumberingAfterBreak="0">
     <w:nsid w:val="413001B2"/>
     <w:multiLevelType w:val="hybridMultilevel"/>
     <w:tmpl w:val="4F7801F8"/>
@@ -5143,7 +6440,346 @@
       </w:rPr>
     </w:lvl>
   </w:abstractNum>
-  <w:abstractNum w:abstractNumId="4" w15:restartNumberingAfterBreak="0">
+  <w:abstractNum w:abstractNumId="7" w15:restartNumberingAfterBreak="0">
+    <w:nsid w:val="4211460D"/>
+    <w:multiLevelType w:val="hybridMultilevel"/>
+    <w:tmpl w:val="5EE4D034"/>
+    <w:lvl w:ilvl="0" w:tplc="08090001">
+      <w:start w:val="1"/>
+      <w:numFmt w:val="bullet"/>
+      <w:lvlText w:val=""/>
+      <w:lvlJc w:val="left"/>
+      <w:pPr>
+        <w:ind w:left="720" w:hanging="360"/>
+      </w:pPr>
+      <w:rPr>
+        <w:rFonts w:ascii="Symbol" w:hAnsi="Symbol" w:hint="default"/>
+      </w:rPr>
+    </w:lvl>
+    <w:lvl w:ilvl="1" w:tplc="08090003" w:tentative="1">
+      <w:start w:val="1"/>
+      <w:numFmt w:val="bullet"/>
+      <w:lvlText w:val="o"/>
+      <w:lvlJc w:val="left"/>
+      <w:pPr>
+        <w:ind w:left="1440" w:hanging="360"/>
+      </w:pPr>
+      <w:rPr>
+        <w:rFonts w:ascii="Courier New" w:hAnsi="Courier New" w:cs="Courier New" w:hint="default"/>
+      </w:rPr>
+    </w:lvl>
+    <w:lvl w:ilvl="2" w:tplc="08090005" w:tentative="1">
+      <w:start w:val="1"/>
+      <w:numFmt w:val="bullet"/>
+      <w:lvlText w:val=""/>
+      <w:lvlJc w:val="left"/>
+      <w:pPr>
+        <w:ind w:left="2160" w:hanging="360"/>
+      </w:pPr>
+      <w:rPr>
+        <w:rFonts w:ascii="Wingdings" w:hAnsi="Wingdings" w:hint="default"/>
+      </w:rPr>
+    </w:lvl>
+    <w:lvl w:ilvl="3" w:tplc="08090001" w:tentative="1">
+      <w:start w:val="1"/>
+      <w:numFmt w:val="bullet"/>
+      <w:lvlText w:val=""/>
+      <w:lvlJc w:val="left"/>
+      <w:pPr>
+        <w:ind w:left="2880" w:hanging="360"/>
+      </w:pPr>
+      <w:rPr>
+        <w:rFonts w:ascii="Symbol" w:hAnsi="Symbol" w:hint="default"/>
+      </w:rPr>
+    </w:lvl>
+    <w:lvl w:ilvl="4" w:tplc="08090003" w:tentative="1">
+      <w:start w:val="1"/>
+      <w:numFmt w:val="bullet"/>
+      <w:lvlText w:val="o"/>
+      <w:lvlJc w:val="left"/>
+      <w:pPr>
+        <w:ind w:left="3600" w:hanging="360"/>
+      </w:pPr>
+      <w:rPr>
+        <w:rFonts w:ascii="Courier New" w:hAnsi="Courier New" w:cs="Courier New" w:hint="default"/>
+      </w:rPr>
+    </w:lvl>
+    <w:lvl w:ilvl="5" w:tplc="08090005" w:tentative="1">
+      <w:start w:val="1"/>
+      <w:numFmt w:val="bullet"/>
+      <w:lvlText w:val=""/>
+      <w:lvlJc w:val="left"/>
+      <w:pPr>
+        <w:ind w:left="4320" w:hanging="360"/>
+      </w:pPr>
+      <w:rPr>
+        <w:rFonts w:ascii="Wingdings" w:hAnsi="Wingdings" w:hint="default"/>
+      </w:rPr>
+    </w:lvl>
+    <w:lvl w:ilvl="6" w:tplc="08090001" w:tentative="1">
+      <w:start w:val="1"/>
+      <w:numFmt w:val="bullet"/>
+      <w:lvlText w:val=""/>
+      <w:lvlJc w:val="left"/>
+      <w:pPr>
+        <w:ind w:left="5040" w:hanging="360"/>
+      </w:pPr>
+      <w:rPr>
+        <w:rFonts w:ascii="Symbol" w:hAnsi="Symbol" w:hint="default"/>
+      </w:rPr>
+    </w:lvl>
+    <w:lvl w:ilvl="7" w:tplc="08090003" w:tentative="1">
+      <w:start w:val="1"/>
+      <w:numFmt w:val="bullet"/>
+      <w:lvlText w:val="o"/>
+      <w:lvlJc w:val="left"/>
+      <w:pPr>
+        <w:ind w:left="5760" w:hanging="360"/>
+      </w:pPr>
+      <w:rPr>
+        <w:rFonts w:ascii="Courier New" w:hAnsi="Courier New" w:cs="Courier New" w:hint="default"/>
+      </w:rPr>
+    </w:lvl>
+    <w:lvl w:ilvl="8" w:tplc="08090005" w:tentative="1">
+      <w:start w:val="1"/>
+      <w:numFmt w:val="bullet"/>
+      <w:lvlText w:val=""/>
+      <w:lvlJc w:val="left"/>
+      <w:pPr>
+        <w:ind w:left="6480" w:hanging="360"/>
+      </w:pPr>
+      <w:rPr>
+        <w:rFonts w:ascii="Wingdings" w:hAnsi="Wingdings" w:hint="default"/>
+      </w:rPr>
+    </w:lvl>
+  </w:abstractNum>
+  <w:abstractNum w:abstractNumId="8" w15:restartNumberingAfterBreak="0">
+    <w:nsid w:val="52B529D1"/>
+    <w:multiLevelType w:val="hybridMultilevel"/>
+    <w:tmpl w:val="F710CEC8"/>
+    <w:lvl w:ilvl="0" w:tplc="08090001">
+      <w:start w:val="1"/>
+      <w:numFmt w:val="bullet"/>
+      <w:lvlText w:val=""/>
+      <w:lvlJc w:val="left"/>
+      <w:pPr>
+        <w:ind w:left="720" w:hanging="360"/>
+      </w:pPr>
+      <w:rPr>
+        <w:rFonts w:ascii="Symbol" w:hAnsi="Symbol" w:hint="default"/>
+      </w:rPr>
+    </w:lvl>
+    <w:lvl w:ilvl="1" w:tplc="08090003" w:tentative="1">
+      <w:start w:val="1"/>
+      <w:numFmt w:val="bullet"/>
+      <w:lvlText w:val="o"/>
+      <w:lvlJc w:val="left"/>
+      <w:pPr>
+        <w:ind w:left="1440" w:hanging="360"/>
+      </w:pPr>
+      <w:rPr>
+        <w:rFonts w:ascii="Courier New" w:hAnsi="Courier New" w:cs="Courier New" w:hint="default"/>
+      </w:rPr>
+    </w:lvl>
+    <w:lvl w:ilvl="2" w:tplc="08090005" w:tentative="1">
+      <w:start w:val="1"/>
+      <w:numFmt w:val="bullet"/>
+      <w:lvlText w:val=""/>
+      <w:lvlJc w:val="left"/>
+      <w:pPr>
+        <w:ind w:left="2160" w:hanging="360"/>
+      </w:pPr>
+      <w:rPr>
+        <w:rFonts w:ascii="Wingdings" w:hAnsi="Wingdings" w:hint="default"/>
+      </w:rPr>
+    </w:lvl>
+    <w:lvl w:ilvl="3" w:tplc="08090001" w:tentative="1">
+      <w:start w:val="1"/>
+      <w:numFmt w:val="bullet"/>
+      <w:lvlText w:val=""/>
+      <w:lvlJc w:val="left"/>
+      <w:pPr>
+        <w:ind w:left="2880" w:hanging="360"/>
+      </w:pPr>
+      <w:rPr>
+        <w:rFonts w:ascii="Symbol" w:hAnsi="Symbol" w:hint="default"/>
+      </w:rPr>
+    </w:lvl>
+    <w:lvl w:ilvl="4" w:tplc="08090003" w:tentative="1">
+      <w:start w:val="1"/>
+      <w:numFmt w:val="bullet"/>
+      <w:lvlText w:val="o"/>
+      <w:lvlJc w:val="left"/>
+      <w:pPr>
+        <w:ind w:left="3600" w:hanging="360"/>
+      </w:pPr>
+      <w:rPr>
+        <w:rFonts w:ascii="Courier New" w:hAnsi="Courier New" w:cs="Courier New" w:hint="default"/>
+      </w:rPr>
+    </w:lvl>
+    <w:lvl w:ilvl="5" w:tplc="08090005" w:tentative="1">
+      <w:start w:val="1"/>
+      <w:numFmt w:val="bullet"/>
+      <w:lvlText w:val=""/>
+      <w:lvlJc w:val="left"/>
+      <w:pPr>
+        <w:ind w:left="4320" w:hanging="360"/>
+      </w:pPr>
+      <w:rPr>
+        <w:rFonts w:ascii="Wingdings" w:hAnsi="Wingdings" w:hint="default"/>
+      </w:rPr>
+    </w:lvl>
+    <w:lvl w:ilvl="6" w:tplc="08090001" w:tentative="1">
+      <w:start w:val="1"/>
+      <w:numFmt w:val="bullet"/>
+      <w:lvlText w:val=""/>
+      <w:lvlJc w:val="left"/>
+      <w:pPr>
+        <w:ind w:left="5040" w:hanging="360"/>
+      </w:pPr>
+      <w:rPr>
+        <w:rFonts w:ascii="Symbol" w:hAnsi="Symbol" w:hint="default"/>
+      </w:rPr>
+    </w:lvl>
+    <w:lvl w:ilvl="7" w:tplc="08090003" w:tentative="1">
+      <w:start w:val="1"/>
+      <w:numFmt w:val="bullet"/>
+      <w:lvlText w:val="o"/>
+      <w:lvlJc w:val="left"/>
+      <w:pPr>
+        <w:ind w:left="5760" w:hanging="360"/>
+      </w:pPr>
+      <w:rPr>
+        <w:rFonts w:ascii="Courier New" w:hAnsi="Courier New" w:cs="Courier New" w:hint="default"/>
+      </w:rPr>
+    </w:lvl>
+    <w:lvl w:ilvl="8" w:tplc="08090005" w:tentative="1">
+      <w:start w:val="1"/>
+      <w:numFmt w:val="bullet"/>
+      <w:lvlText w:val=""/>
+      <w:lvlJc w:val="left"/>
+      <w:pPr>
+        <w:ind w:left="6480" w:hanging="360"/>
+      </w:pPr>
+      <w:rPr>
+        <w:rFonts w:ascii="Wingdings" w:hAnsi="Wingdings" w:hint="default"/>
+      </w:rPr>
+    </w:lvl>
+  </w:abstractNum>
+  <w:abstractNum w:abstractNumId="9" w15:restartNumberingAfterBreak="0">
+    <w:nsid w:val="58783919"/>
+    <w:multiLevelType w:val="hybridMultilevel"/>
+    <w:tmpl w:val="468CF28A"/>
+    <w:lvl w:ilvl="0" w:tplc="08090001">
+      <w:start w:val="1"/>
+      <w:numFmt w:val="bullet"/>
+      <w:lvlText w:val=""/>
+      <w:lvlJc w:val="left"/>
+      <w:pPr>
+        <w:ind w:left="720" w:hanging="360"/>
+      </w:pPr>
+      <w:rPr>
+        <w:rFonts w:ascii="Symbol" w:hAnsi="Symbol" w:hint="default"/>
+      </w:rPr>
+    </w:lvl>
+    <w:lvl w:ilvl="1" w:tplc="08090003" w:tentative="1">
+      <w:start w:val="1"/>
+      <w:numFmt w:val="bullet"/>
+      <w:lvlText w:val="o"/>
+      <w:lvlJc w:val="left"/>
+      <w:pPr>
+        <w:ind w:left="1440" w:hanging="360"/>
+      </w:pPr>
+      <w:rPr>
+        <w:rFonts w:ascii="Courier New" w:hAnsi="Courier New" w:cs="Courier New" w:hint="default"/>
+      </w:rPr>
+    </w:lvl>
+    <w:lvl w:ilvl="2" w:tplc="08090005" w:tentative="1">
+      <w:start w:val="1"/>
+      <w:numFmt w:val="bullet"/>
+      <w:lvlText w:val=""/>
+      <w:lvlJc w:val="left"/>
+      <w:pPr>
+        <w:ind w:left="2160" w:hanging="360"/>
+      </w:pPr>
+      <w:rPr>
+        <w:rFonts w:ascii="Wingdings" w:hAnsi="Wingdings" w:hint="default"/>
+      </w:rPr>
+    </w:lvl>
+    <w:lvl w:ilvl="3" w:tplc="08090001" w:tentative="1">
+      <w:start w:val="1"/>
+      <w:numFmt w:val="bullet"/>
+      <w:lvlText w:val=""/>
+      <w:lvlJc w:val="left"/>
+      <w:pPr>
+        <w:ind w:left="2880" w:hanging="360"/>
+      </w:pPr>
+      <w:rPr>
+        <w:rFonts w:ascii="Symbol" w:hAnsi="Symbol" w:hint="default"/>
+      </w:rPr>
+    </w:lvl>
+    <w:lvl w:ilvl="4" w:tplc="08090003" w:tentative="1">
+      <w:start w:val="1"/>
+      <w:numFmt w:val="bullet"/>
+      <w:lvlText w:val="o"/>
+      <w:lvlJc w:val="left"/>
+      <w:pPr>
+        <w:ind w:left="3600" w:hanging="360"/>
+      </w:pPr>
+      <w:rPr>
+        <w:rFonts w:ascii="Courier New" w:hAnsi="Courier New" w:cs="Courier New" w:hint="default"/>
+      </w:rPr>
+    </w:lvl>
+    <w:lvl w:ilvl="5" w:tplc="08090005" w:tentative="1">
+      <w:start w:val="1"/>
+      <w:numFmt w:val="bullet"/>
+      <w:lvlText w:val=""/>
+      <w:lvlJc w:val="left"/>
+      <w:pPr>
+        <w:ind w:left="4320" w:hanging="360"/>
+      </w:pPr>
+      <w:rPr>
+        <w:rFonts w:ascii="Wingdings" w:hAnsi="Wingdings" w:hint="default"/>
+      </w:rPr>
+    </w:lvl>
+    <w:lvl w:ilvl="6" w:tplc="08090001" w:tentative="1">
+      <w:start w:val="1"/>
+      <w:numFmt w:val="bullet"/>
+      <w:lvlText w:val=""/>
+      <w:lvlJc w:val="left"/>
+      <w:pPr>
+        <w:ind w:left="5040" w:hanging="360"/>
+      </w:pPr>
+      <w:rPr>
+        <w:rFonts w:ascii="Symbol" w:hAnsi="Symbol" w:hint="default"/>
+      </w:rPr>
+    </w:lvl>
+    <w:lvl w:ilvl="7" w:tplc="08090003" w:tentative="1">
+      <w:start w:val="1"/>
+      <w:numFmt w:val="bullet"/>
+      <w:lvlText w:val="o"/>
+      <w:lvlJc w:val="left"/>
+      <w:pPr>
+        <w:ind w:left="5760" w:hanging="360"/>
+      </w:pPr>
+      <w:rPr>
+        <w:rFonts w:ascii="Courier New" w:hAnsi="Courier New" w:cs="Courier New" w:hint="default"/>
+      </w:rPr>
+    </w:lvl>
+    <w:lvl w:ilvl="8" w:tplc="08090005" w:tentative="1">
+      <w:start w:val="1"/>
+      <w:numFmt w:val="bullet"/>
+      <w:lvlText w:val=""/>
+      <w:lvlJc w:val="left"/>
+      <w:pPr>
+        <w:ind w:left="6480" w:hanging="360"/>
+      </w:pPr>
+      <w:rPr>
+        <w:rFonts w:ascii="Wingdings" w:hAnsi="Wingdings" w:hint="default"/>
+      </w:rPr>
+    </w:lvl>
+  </w:abstractNum>
+  <w:abstractNum w:abstractNumId="10" w15:restartNumberingAfterBreak="0">
     <w:nsid w:val="5C6F5F6C"/>
     <w:multiLevelType w:val="hybridMultilevel"/>
     <w:tmpl w:val="2DF0C29A"/>
@@ -5255,7 +6891,7 @@
       </w:rPr>
     </w:lvl>
   </w:abstractNum>
-  <w:abstractNum w:abstractNumId="5" w15:restartNumberingAfterBreak="0">
+  <w:abstractNum w:abstractNumId="11" w15:restartNumberingAfterBreak="0">
     <w:nsid w:val="64A14EC2"/>
     <w:multiLevelType w:val="hybridMultilevel"/>
     <w:tmpl w:val="7570CC3C"/>
@@ -5368,7 +7004,382 @@
       </w:rPr>
     </w:lvl>
   </w:abstractNum>
-  <w:abstractNum w:abstractNumId="6" w15:restartNumberingAfterBreak="0">
+  <w:abstractNum w:abstractNumId="12" w15:restartNumberingAfterBreak="0">
+    <w:nsid w:val="667F73DF"/>
+    <w:multiLevelType w:val="hybridMultilevel"/>
+    <w:tmpl w:val="263641BA"/>
+    <w:lvl w:ilvl="0" w:tplc="08090001">
+      <w:start w:val="1"/>
+      <w:numFmt w:val="bullet"/>
+      <w:lvlText w:val=""/>
+      <w:lvlJc w:val="left"/>
+      <w:pPr>
+        <w:ind w:left="720" w:hanging="360"/>
+      </w:pPr>
+      <w:rPr>
+        <w:rFonts w:ascii="Symbol" w:hAnsi="Symbol" w:hint="default"/>
+      </w:rPr>
+    </w:lvl>
+    <w:lvl w:ilvl="1" w:tplc="08090003" w:tentative="1">
+      <w:start w:val="1"/>
+      <w:numFmt w:val="bullet"/>
+      <w:lvlText w:val="o"/>
+      <w:lvlJc w:val="left"/>
+      <w:pPr>
+        <w:ind w:left="1440" w:hanging="360"/>
+      </w:pPr>
+      <w:rPr>
+        <w:rFonts w:ascii="Courier New" w:hAnsi="Courier New" w:cs="Courier New" w:hint="default"/>
+      </w:rPr>
+    </w:lvl>
+    <w:lvl w:ilvl="2" w:tplc="08090005" w:tentative="1">
+      <w:start w:val="1"/>
+      <w:numFmt w:val="bullet"/>
+      <w:lvlText w:val=""/>
+      <w:lvlJc w:val="left"/>
+      <w:pPr>
+        <w:ind w:left="2160" w:hanging="360"/>
+      </w:pPr>
+      <w:rPr>
+        <w:rFonts w:ascii="Wingdings" w:hAnsi="Wingdings" w:hint="default"/>
+      </w:rPr>
+    </w:lvl>
+    <w:lvl w:ilvl="3" w:tplc="08090001" w:tentative="1">
+      <w:start w:val="1"/>
+      <w:numFmt w:val="bullet"/>
+      <w:lvlText w:val=""/>
+      <w:lvlJc w:val="left"/>
+      <w:pPr>
+        <w:ind w:left="2880" w:hanging="360"/>
+      </w:pPr>
+      <w:rPr>
+        <w:rFonts w:ascii="Symbol" w:hAnsi="Symbol" w:hint="default"/>
+      </w:rPr>
+    </w:lvl>
+    <w:lvl w:ilvl="4" w:tplc="08090003" w:tentative="1">
+      <w:start w:val="1"/>
+      <w:numFmt w:val="bullet"/>
+      <w:lvlText w:val="o"/>
+      <w:lvlJc w:val="left"/>
+      <w:pPr>
+        <w:ind w:left="3600" w:hanging="360"/>
+      </w:pPr>
+      <w:rPr>
+        <w:rFonts w:ascii="Courier New" w:hAnsi="Courier New" w:cs="Courier New" w:hint="default"/>
+      </w:rPr>
+    </w:lvl>
+    <w:lvl w:ilvl="5" w:tplc="08090005" w:tentative="1">
+      <w:start w:val="1"/>
+      <w:numFmt w:val="bullet"/>
+      <w:lvlText w:val=""/>
+      <w:lvlJc w:val="left"/>
+      <w:pPr>
+        <w:ind w:left="4320" w:hanging="360"/>
+      </w:pPr>
+      <w:rPr>
+        <w:rFonts w:ascii="Wingdings" w:hAnsi="Wingdings" w:hint="default"/>
+      </w:rPr>
+    </w:lvl>
+    <w:lvl w:ilvl="6" w:tplc="08090001" w:tentative="1">
+      <w:start w:val="1"/>
+      <w:numFmt w:val="bullet"/>
+      <w:lvlText w:val=""/>
+      <w:lvlJc w:val="left"/>
+      <w:pPr>
+        <w:ind w:left="5040" w:hanging="360"/>
+      </w:pPr>
+      <w:rPr>
+        <w:rFonts w:ascii="Symbol" w:hAnsi="Symbol" w:hint="default"/>
+      </w:rPr>
+    </w:lvl>
+    <w:lvl w:ilvl="7" w:tplc="08090003" w:tentative="1">
+      <w:start w:val="1"/>
+      <w:numFmt w:val="bullet"/>
+      <w:lvlText w:val="o"/>
+      <w:lvlJc w:val="left"/>
+      <w:pPr>
+        <w:ind w:left="5760" w:hanging="360"/>
+      </w:pPr>
+      <w:rPr>
+        <w:rFonts w:ascii="Courier New" w:hAnsi="Courier New" w:cs="Courier New" w:hint="default"/>
+      </w:rPr>
+    </w:lvl>
+    <w:lvl w:ilvl="8" w:tplc="08090005" w:tentative="1">
+      <w:start w:val="1"/>
+      <w:numFmt w:val="bullet"/>
+      <w:lvlText w:val=""/>
+      <w:lvlJc w:val="left"/>
+      <w:pPr>
+        <w:ind w:left="6480" w:hanging="360"/>
+      </w:pPr>
+      <w:rPr>
+        <w:rFonts w:ascii="Wingdings" w:hAnsi="Wingdings" w:hint="default"/>
+      </w:rPr>
+    </w:lvl>
+  </w:abstractNum>
+  <w:abstractNum w:abstractNumId="13" w15:restartNumberingAfterBreak="0">
+    <w:nsid w:val="6B671992"/>
+    <w:multiLevelType w:val="hybridMultilevel"/>
+    <w:tmpl w:val="7194CAAC"/>
+    <w:lvl w:ilvl="0" w:tplc="08090001">
+      <w:start w:val="1"/>
+      <w:numFmt w:val="bullet"/>
+      <w:lvlText w:val=""/>
+      <w:lvlJc w:val="left"/>
+      <w:pPr>
+        <w:ind w:left="720" w:hanging="360"/>
+      </w:pPr>
+      <w:rPr>
+        <w:rFonts w:ascii="Symbol" w:hAnsi="Symbol" w:hint="default"/>
+      </w:rPr>
+    </w:lvl>
+    <w:lvl w:ilvl="1" w:tplc="08090003" w:tentative="1">
+      <w:start w:val="1"/>
+      <w:numFmt w:val="bullet"/>
+      <w:lvlText w:val="o"/>
+      <w:lvlJc w:val="left"/>
+      <w:pPr>
+        <w:ind w:left="1440" w:hanging="360"/>
+      </w:pPr>
+      <w:rPr>
+        <w:rFonts w:ascii="Courier New" w:hAnsi="Courier New" w:cs="Courier New" w:hint="default"/>
+      </w:rPr>
+    </w:lvl>
+    <w:lvl w:ilvl="2" w:tplc="08090005" w:tentative="1">
+      <w:start w:val="1"/>
+      <w:numFmt w:val="bullet"/>
+      <w:lvlText w:val=""/>
+      <w:lvlJc w:val="left"/>
+      <w:pPr>
+        <w:ind w:left="2160" w:hanging="360"/>
+      </w:pPr>
+      <w:rPr>
+        <w:rFonts w:ascii="Wingdings" w:hAnsi="Wingdings" w:hint="default"/>
+      </w:rPr>
+    </w:lvl>
+    <w:lvl w:ilvl="3" w:tplc="08090001" w:tentative="1">
+      <w:start w:val="1"/>
+      <w:numFmt w:val="bullet"/>
+      <w:lvlText w:val=""/>
+      <w:lvlJc w:val="left"/>
+      <w:pPr>
+        <w:ind w:left="2880" w:hanging="360"/>
+      </w:pPr>
+      <w:rPr>
+        <w:rFonts w:ascii="Symbol" w:hAnsi="Symbol" w:hint="default"/>
+      </w:rPr>
+    </w:lvl>
+    <w:lvl w:ilvl="4" w:tplc="08090003" w:tentative="1">
+      <w:start w:val="1"/>
+      <w:numFmt w:val="bullet"/>
+      <w:lvlText w:val="o"/>
+      <w:lvlJc w:val="left"/>
+      <w:pPr>
+        <w:ind w:left="3600" w:hanging="360"/>
+      </w:pPr>
+      <w:rPr>
+        <w:rFonts w:ascii="Courier New" w:hAnsi="Courier New" w:cs="Courier New" w:hint="default"/>
+      </w:rPr>
+    </w:lvl>
+    <w:lvl w:ilvl="5" w:tplc="08090005" w:tentative="1">
+      <w:start w:val="1"/>
+      <w:numFmt w:val="bullet"/>
+      <w:lvlText w:val=""/>
+      <w:lvlJc w:val="left"/>
+      <w:pPr>
+        <w:ind w:left="4320" w:hanging="360"/>
+      </w:pPr>
+      <w:rPr>
+        <w:rFonts w:ascii="Wingdings" w:hAnsi="Wingdings" w:hint="default"/>
+      </w:rPr>
+    </w:lvl>
+    <w:lvl w:ilvl="6" w:tplc="08090001" w:tentative="1">
+      <w:start w:val="1"/>
+      <w:numFmt w:val="bullet"/>
+      <w:lvlText w:val=""/>
+      <w:lvlJc w:val="left"/>
+      <w:pPr>
+        <w:ind w:left="5040" w:hanging="360"/>
+      </w:pPr>
+      <w:rPr>
+        <w:rFonts w:ascii="Symbol" w:hAnsi="Symbol" w:hint="default"/>
+      </w:rPr>
+    </w:lvl>
+    <w:lvl w:ilvl="7" w:tplc="08090003" w:tentative="1">
+      <w:start w:val="1"/>
+      <w:numFmt w:val="bullet"/>
+      <w:lvlText w:val="o"/>
+      <w:lvlJc w:val="left"/>
+      <w:pPr>
+        <w:ind w:left="5760" w:hanging="360"/>
+      </w:pPr>
+      <w:rPr>
+        <w:rFonts w:ascii="Courier New" w:hAnsi="Courier New" w:cs="Courier New" w:hint="default"/>
+      </w:rPr>
+    </w:lvl>
+    <w:lvl w:ilvl="8" w:tplc="08090005" w:tentative="1">
+      <w:start w:val="1"/>
+      <w:numFmt w:val="bullet"/>
+      <w:lvlText w:val=""/>
+      <w:lvlJc w:val="left"/>
+      <w:pPr>
+        <w:ind w:left="6480" w:hanging="360"/>
+      </w:pPr>
+      <w:rPr>
+        <w:rFonts w:ascii="Wingdings" w:hAnsi="Wingdings" w:hint="default"/>
+      </w:rPr>
+    </w:lvl>
+  </w:abstractNum>
+  <w:abstractNum w:abstractNumId="14" w15:restartNumberingAfterBreak="0">
+    <w:nsid w:val="7608537E"/>
+    <w:multiLevelType w:val="multilevel"/>
+    <w:tmpl w:val="B7E43EDC"/>
+    <w:lvl w:ilvl="0">
+      <w:start w:val="1"/>
+      <w:numFmt w:val="bullet"/>
+      <w:lvlText w:val=""/>
+      <w:lvlJc w:val="left"/>
+      <w:pPr>
+        <w:tabs>
+          <w:tab w:val="num" w:pos="720"/>
+        </w:tabs>
+        <w:ind w:left="720" w:hanging="360"/>
+      </w:pPr>
+      <w:rPr>
+        <w:rFonts w:ascii="Symbol" w:hAnsi="Symbol" w:hint="default"/>
+        <w:sz w:val="20"/>
+      </w:rPr>
+    </w:lvl>
+    <w:lvl w:ilvl="1" w:tentative="1">
+      <w:start w:val="1"/>
+      <w:numFmt w:val="bullet"/>
+      <w:lvlText w:val="o"/>
+      <w:lvlJc w:val="left"/>
+      <w:pPr>
+        <w:tabs>
+          <w:tab w:val="num" w:pos="1440"/>
+        </w:tabs>
+        <w:ind w:left="1440" w:hanging="360"/>
+      </w:pPr>
+      <w:rPr>
+        <w:rFonts w:ascii="Courier New" w:hAnsi="Courier New" w:hint="default"/>
+        <w:sz w:val="20"/>
+      </w:rPr>
+    </w:lvl>
+    <w:lvl w:ilvl="2" w:tentative="1">
+      <w:start w:val="1"/>
+      <w:numFmt w:val="bullet"/>
+      <w:lvlText w:val=""/>
+      <w:lvlJc w:val="left"/>
+      <w:pPr>
+        <w:tabs>
+          <w:tab w:val="num" w:pos="2160"/>
+        </w:tabs>
+        <w:ind w:left="2160" w:hanging="360"/>
+      </w:pPr>
+      <w:rPr>
+        <w:rFonts w:ascii="Wingdings" w:hAnsi="Wingdings" w:hint="default"/>
+        <w:sz w:val="20"/>
+      </w:rPr>
+    </w:lvl>
+    <w:lvl w:ilvl="3" w:tentative="1">
+      <w:start w:val="1"/>
+      <w:numFmt w:val="bullet"/>
+      <w:lvlText w:val=""/>
+      <w:lvlJc w:val="left"/>
+      <w:pPr>
+        <w:tabs>
+          <w:tab w:val="num" w:pos="2880"/>
+        </w:tabs>
+        <w:ind w:left="2880" w:hanging="360"/>
+      </w:pPr>
+      <w:rPr>
+        <w:rFonts w:ascii="Wingdings" w:hAnsi="Wingdings" w:hint="default"/>
+        <w:sz w:val="20"/>
+      </w:rPr>
+    </w:lvl>
+    <w:lvl w:ilvl="4" w:tentative="1">
+      <w:start w:val="1"/>
+      <w:numFmt w:val="bullet"/>
+      <w:lvlText w:val=""/>
+      <w:lvlJc w:val="left"/>
+      <w:pPr>
+        <w:tabs>
+          <w:tab w:val="num" w:pos="3600"/>
+        </w:tabs>
+        <w:ind w:left="3600" w:hanging="360"/>
+      </w:pPr>
+      <w:rPr>
+        <w:rFonts w:ascii="Wingdings" w:hAnsi="Wingdings" w:hint="default"/>
+        <w:sz w:val="20"/>
+      </w:rPr>
+    </w:lvl>
+    <w:lvl w:ilvl="5" w:tentative="1">
+      <w:start w:val="1"/>
+      <w:numFmt w:val="bullet"/>
+      <w:lvlText w:val=""/>
+      <w:lvlJc w:val="left"/>
+      <w:pPr>
+        <w:tabs>
+          <w:tab w:val="num" w:pos="4320"/>
+        </w:tabs>
+        <w:ind w:left="4320" w:hanging="360"/>
+      </w:pPr>
+      <w:rPr>
+        <w:rFonts w:ascii="Wingdings" w:hAnsi="Wingdings" w:hint="default"/>
+        <w:sz w:val="20"/>
+      </w:rPr>
+    </w:lvl>
+    <w:lvl w:ilvl="6" w:tentative="1">
+      <w:start w:val="1"/>
+      <w:numFmt w:val="bullet"/>
+      <w:lvlText w:val=""/>
+      <w:lvlJc w:val="left"/>
+      <w:pPr>
+        <w:tabs>
+          <w:tab w:val="num" w:pos="5040"/>
+        </w:tabs>
+        <w:ind w:left="5040" w:hanging="360"/>
+      </w:pPr>
+      <w:rPr>
+        <w:rFonts w:ascii="Wingdings" w:hAnsi="Wingdings" w:hint="default"/>
+        <w:sz w:val="20"/>
+      </w:rPr>
+    </w:lvl>
+    <w:lvl w:ilvl="7" w:tentative="1">
+      <w:start w:val="1"/>
+      <w:numFmt w:val="bullet"/>
+      <w:lvlText w:val=""/>
+      <w:lvlJc w:val="left"/>
+      <w:pPr>
+        <w:tabs>
+          <w:tab w:val="num" w:pos="5760"/>
+        </w:tabs>
+        <w:ind w:left="5760" w:hanging="360"/>
+      </w:pPr>
+      <w:rPr>
+        <w:rFonts w:ascii="Wingdings" w:hAnsi="Wingdings" w:hint="default"/>
+        <w:sz w:val="20"/>
+      </w:rPr>
+    </w:lvl>
+    <w:lvl w:ilvl="8" w:tentative="1">
+      <w:start w:val="1"/>
+      <w:numFmt w:val="bullet"/>
+      <w:lvlText w:val=""/>
+      <w:lvlJc w:val="left"/>
+      <w:pPr>
+        <w:tabs>
+          <w:tab w:val="num" w:pos="6480"/>
+        </w:tabs>
+        <w:ind w:left="6480" w:hanging="360"/>
+      </w:pPr>
+      <w:rPr>
+        <w:rFonts w:ascii="Wingdings" w:hAnsi="Wingdings" w:hint="default"/>
+        <w:sz w:val="20"/>
+      </w:rPr>
+    </w:lvl>
+  </w:abstractNum>
+  <w:abstractNum w:abstractNumId="15" w15:restartNumberingAfterBreak="0">
     <w:nsid w:val="7BFA6A64"/>
     <w:multiLevelType w:val="hybridMultilevel"/>
     <w:tmpl w:val="7A28B8B4"/>
@@ -5482,25 +7493,52 @@
     </w:lvl>
   </w:abstractNum>
   <w:num w:numId="1" w16cid:durableId="786584124">
+    <w:abstractNumId w:val="10"/>
+  </w:num>
+  <w:num w:numId="2" w16cid:durableId="528225861">
+    <w:abstractNumId w:val="1"/>
+  </w:num>
+  <w:num w:numId="3" w16cid:durableId="1041638795">
+    <w:abstractNumId w:val="15"/>
+  </w:num>
+  <w:num w:numId="4" w16cid:durableId="671375810">
+    <w:abstractNumId w:val="6"/>
+  </w:num>
+  <w:num w:numId="5" w16cid:durableId="1758865447">
+    <w:abstractNumId w:val="5"/>
+  </w:num>
+  <w:num w:numId="6" w16cid:durableId="1572806653">
+    <w:abstractNumId w:val="11"/>
+  </w:num>
+  <w:num w:numId="7" w16cid:durableId="850526655">
+    <w:abstractNumId w:val="3"/>
+  </w:num>
+  <w:num w:numId="8" w16cid:durableId="351998077">
+    <w:abstractNumId w:val="7"/>
+  </w:num>
+  <w:num w:numId="9" w16cid:durableId="2141796834">
+    <w:abstractNumId w:val="8"/>
+  </w:num>
+  <w:num w:numId="10" w16cid:durableId="1162349973">
     <w:abstractNumId w:val="4"/>
   </w:num>
-  <w:num w:numId="2" w16cid:durableId="528225861">
+  <w:num w:numId="11" w16cid:durableId="996690820">
+    <w:abstractNumId w:val="9"/>
+  </w:num>
+  <w:num w:numId="12" w16cid:durableId="404500438">
+    <w:abstractNumId w:val="12"/>
+  </w:num>
+  <w:num w:numId="13" w16cid:durableId="1832329496">
     <w:abstractNumId w:val="0"/>
   </w:num>
-  <w:num w:numId="3" w16cid:durableId="1041638795">
-    <w:abstractNumId w:val="6"/>
-  </w:num>
-  <w:num w:numId="4" w16cid:durableId="671375810">
-    <w:abstractNumId w:val="3"/>
-  </w:num>
-  <w:num w:numId="5" w16cid:durableId="1758865447">
+  <w:num w:numId="14" w16cid:durableId="935283413">
     <w:abstractNumId w:val="2"/>
   </w:num>
-  <w:num w:numId="6" w16cid:durableId="1572806653">
-    <w:abstractNumId w:val="5"/>
+  <w:num w:numId="15" w16cid:durableId="1840002798">
+    <w:abstractNumId w:val="14"/>
   </w:num>
-  <w:num w:numId="7" w16cid:durableId="850526655">
-    <w:abstractNumId w:val="1"/>
+  <w:num w:numId="16" w16cid:durableId="313726949">
+    <w:abstractNumId w:val="13"/>
   </w:num>
 </w:numbering>
 </file>
@@ -6572,6 +8610,36 @@
     <w:unhideWhenUsed/>
     <w:rsid w:val="00310B0B"/>
   </w:style>
+  <w:style w:type="paragraph" w:styleId="Caption">
+    <w:name w:val="caption"/>
+    <w:basedOn w:val="Normal"/>
+    <w:next w:val="Normal"/>
+    <w:uiPriority w:val="35"/>
+    <w:unhideWhenUsed/>
+    <w:qFormat/>
+    <w:rsid w:val="009B041C"/>
+    <w:pPr>
+      <w:spacing w:after="200" w:line="240" w:lineRule="auto"/>
+    </w:pPr>
+    <w:rPr>
+      <w:i/>
+      <w:iCs/>
+      <w:color w:val="44546A" w:themeColor="text2"/>
+      <w:sz w:val="18"/>
+      <w:szCs w:val="18"/>
+    </w:rPr>
+  </w:style>
+  <w:style w:type="paragraph" w:styleId="TableofFigures">
+    <w:name w:val="table of figures"/>
+    <w:basedOn w:val="Normal"/>
+    <w:next w:val="Normal"/>
+    <w:uiPriority w:val="99"/>
+    <w:unhideWhenUsed/>
+    <w:rsid w:val="00805D82"/>
+    <w:pPr>
+      <w:spacing w:after="0"/>
+    </w:pPr>
+  </w:style>
 </w:styles>
 </file>
 

</xml_diff>

<commit_message>
added samples, and an onboarding message
</commit_message>
<xml_diff>
--- a/report.docx
+++ b/report.docx
@@ -11,12 +11,37 @@
           <w:sz w:val="20"/>
         </w:rPr>
       </w:pPr>
+      <w:proofErr w:type="spellStart"/>
       <w:r>
         <w:rPr>
           <w:rFonts w:ascii="Cambria Math" w:hAnsi="Cambria Math"/>
           <w:sz w:val="20"/>
         </w:rPr>
-        <w:t>République Algérienne Démocratique et Populaire</w:t>
+        <w:t>République</w:t>
+      </w:r>
+      <w:proofErr w:type="spellEnd"/>
+      <w:r>
+        <w:rPr>
+          <w:rFonts w:ascii="Cambria Math" w:hAnsi="Cambria Math"/>
+          <w:sz w:val="20"/>
+        </w:rPr>
+        <w:t xml:space="preserve"> </w:t>
+      </w:r>
+      <w:proofErr w:type="spellStart"/>
+      <w:r>
+        <w:rPr>
+          <w:rFonts w:ascii="Cambria Math" w:hAnsi="Cambria Math"/>
+          <w:sz w:val="20"/>
+        </w:rPr>
+        <w:t>Algérienne</w:t>
+      </w:r>
+      <w:proofErr w:type="spellEnd"/>
+      <w:r>
+        <w:rPr>
+          <w:rFonts w:ascii="Cambria Math" w:hAnsi="Cambria Math"/>
+          <w:sz w:val="20"/>
+        </w:rPr>
+        <w:t xml:space="preserve"> Démocratique et Populaire</w:t>
       </w:r>
     </w:p>
     <w:p>
@@ -52,8 +77,33 @@
           <w:rFonts w:ascii="Cambria Math" w:hAnsi="Cambria Math"/>
           <w:sz w:val="20"/>
         </w:rPr>
-        <w:t>Ministère de l’Enseignement Supérieur et de la Recherche Scientifique</w:t>
-      </w:r>
+        <w:t xml:space="preserve">Ministère de </w:t>
+      </w:r>
+      <w:proofErr w:type="spellStart"/>
+      <w:r>
+        <w:rPr>
+          <w:rFonts w:ascii="Cambria Math" w:hAnsi="Cambria Math"/>
+          <w:sz w:val="20"/>
+        </w:rPr>
+        <w:t>l’Enseignement</w:t>
+      </w:r>
+      <w:proofErr w:type="spellEnd"/>
+      <w:r>
+        <w:rPr>
+          <w:rFonts w:ascii="Cambria Math" w:hAnsi="Cambria Math"/>
+          <w:sz w:val="20"/>
+        </w:rPr>
+        <w:t xml:space="preserve"> Supérieur et de la Recherche </w:t>
+      </w:r>
+      <w:proofErr w:type="spellStart"/>
+      <w:r>
+        <w:rPr>
+          <w:rFonts w:ascii="Cambria Math" w:hAnsi="Cambria Math"/>
+          <w:sz w:val="20"/>
+        </w:rPr>
+        <w:t>Scientifique</w:t>
+      </w:r>
+      <w:proofErr w:type="spellEnd"/>
     </w:p>
     <w:p>
       <w:pPr>
@@ -527,11 +577,19 @@
                 <w:rFonts w:cs="CMU Serif"/>
               </w:rPr>
             </w:pPr>
+            <w:proofErr w:type="spellStart"/>
             <w:r>
               <w:rPr>
                 <w:rFonts w:cs="CMU Serif"/>
               </w:rPr>
-              <w:t xml:space="preserve">Mme. </w:t>
+              <w:t>Mme.</w:t>
+            </w:r>
+            <w:proofErr w:type="spellEnd"/>
+            <w:r>
+              <w:rPr>
+                <w:rFonts w:cs="CMU Serif"/>
+              </w:rPr>
+              <w:t xml:space="preserve"> BENATCHBA Karima </w:t>
             </w:r>
           </w:p>
           <w:p>
@@ -545,12 +603,28 @@
                 <w:rFonts w:cs="CMU Serif"/>
               </w:rPr>
             </w:pPr>
+            <w:proofErr w:type="spellStart"/>
             <w:r>
               <w:rPr>
                 <w:rFonts w:cs="CMU Serif"/>
               </w:rPr>
               <w:t>Mme.</w:t>
             </w:r>
+            <w:proofErr w:type="spellEnd"/>
+            <w:r>
+              <w:rPr>
+                <w:rFonts w:cs="CMU Serif"/>
+              </w:rPr>
+              <w:t xml:space="preserve"> SADEG </w:t>
+            </w:r>
+            <w:proofErr w:type="spellStart"/>
+            <w:r>
+              <w:rPr>
+                <w:rFonts w:cs="CMU Serif"/>
+              </w:rPr>
+              <w:t>Souhila</w:t>
+            </w:r>
+            <w:proofErr w:type="spellEnd"/>
           </w:p>
         </w:tc>
       </w:tr>
@@ -606,11 +680,19 @@
           <w:rFonts w:cs="CMU Serif"/>
         </w:rPr>
       </w:pPr>
+      <w:proofErr w:type="spellStart"/>
       <w:r>
         <w:rPr>
           <w:rFonts w:cs="CMU Serif"/>
         </w:rPr>
-        <w:t>Systèmes LMCS</w:t>
+        <w:t>Systèmes</w:t>
+      </w:r>
+      <w:proofErr w:type="spellEnd"/>
+      <w:r>
+        <w:rPr>
+          <w:rFonts w:cs="CMU Serif"/>
+        </w:rPr>
+        <w:t xml:space="preserve"> LMCS</w:t>
       </w:r>
     </w:p>
     <w:p>
@@ -636,8 +718,17 @@
         <w:pStyle w:val="Heading2"/>
       </w:pPr>
       <w:bookmarkStart w:id="0" w:name="_Toc241509691"/>
-      <w:r>
-        <w:lastRenderedPageBreak/>
+    </w:p>
+    <w:p>
+      <w:pPr>
+        <w:pStyle w:val="Heading2"/>
+      </w:pPr>
+    </w:p>
+    <w:p>
+      <w:pPr>
+        <w:pStyle w:val="Heading2"/>
+      </w:pPr>
+      <w:r>
         <w:t>Abstract</w:t>
       </w:r>
       <w:bookmarkEnd w:id="0"/>
@@ -653,15 +744,57 @@
       <w:r>
         <w:t xml:space="preserve">This report details the design and development of a modern, web-based automata and Turing machine simulator, completed as part of an academic internship at the </w:t>
       </w:r>
+      <w:proofErr w:type="spellStart"/>
       <w:r>
         <w:rPr>
           <w:i/>
           <w:iCs/>
         </w:rPr>
-        <w:t>Laboratoire de Méthodes de Conception de Systèmes</w:t>
-      </w:r>
-      <w:r>
-        <w:t xml:space="preserve"> (LMCS) within the École Nationale Supérieure d'Informatique (ESI) in Algiers, under the supervision of [Supervisor 1] and [Supervisor 2]. Motivated by the theory-practice gap in formal language education and the limitations of legacy tools—such as rigid Java dependencies and conflicting local formalisms like 4-tuple Turing machine representations and unary bar notations—this project delivers a zero-installation, high-performance simulation platform. Built using TypeScript, React, and Tailwind CSS, the system features a modular M19 execution engine, custom DSL parsers for multiple formal models (FSA, PDA, LBA, TM), a comprehensive algorithm library (including NFA-to-DFA determinisation, mirror automata, and grammar conversions), and an integrated AI tutoring assistant. This report covers the system’s underlying architecture, state transition logic, user interface implementation, and validation testing, providing a comprehensive overview of a tool engineered to modernize formal computing education.</w:t>
+        <w:t>Laboratoire</w:t>
+      </w:r>
+      <w:proofErr w:type="spellEnd"/>
+      <w:r>
+        <w:rPr>
+          <w:i/>
+          <w:iCs/>
+        </w:rPr>
+        <w:t xml:space="preserve"> de </w:t>
+      </w:r>
+      <w:proofErr w:type="spellStart"/>
+      <w:r>
+        <w:rPr>
+          <w:i/>
+          <w:iCs/>
+        </w:rPr>
+        <w:t>Méthodes</w:t>
+      </w:r>
+      <w:proofErr w:type="spellEnd"/>
+      <w:r>
+        <w:rPr>
+          <w:i/>
+          <w:iCs/>
+        </w:rPr>
+        <w:t xml:space="preserve"> de Conception de </w:t>
+      </w:r>
+      <w:proofErr w:type="spellStart"/>
+      <w:r>
+        <w:rPr>
+          <w:i/>
+          <w:iCs/>
+        </w:rPr>
+        <w:t>Systèmes</w:t>
+      </w:r>
+      <w:proofErr w:type="spellEnd"/>
+      <w:r>
+        <w:t xml:space="preserve"> (LMCS) within the École Nationale Supérieure </w:t>
+      </w:r>
+      <w:proofErr w:type="spellStart"/>
+      <w:r>
+        <w:t>d'Informatique</w:t>
+      </w:r>
+      <w:proofErr w:type="spellEnd"/>
+      <w:r>
+        <w:t xml:space="preserve"> (ESI) in Algiers, under the supervision of [Supervisor 1] and [Supervisor 2]. Motivated by the theory-practice gap in formal language education and the limitations of legacy tools—such as rigid Java dependencies and conflicting local formalisms like 4-tuple Turing machine representations and unary bar notations—this project delivers a zero-installation, high-performance simulation platform. Built using TypeScript, React, and Tailwind CSS, the system features a modular M19 execution engine, custom DSL parsers for multiple formal models (FSA, PDA, LBA, TM), a comprehensive algorithm library (including NFA-to-DFA determinisation, mirror automata, and grammar conversions), and an integrated AI tutoring assistant. This report covers the system’s underlying architecture, state transition logic, user interface implementation, and validation testing, providing a comprehensive overview of a tool engineered to modernize formal computing education.</w:t>
       </w:r>
     </w:p>
     <w:p>
@@ -734,7 +867,6 @@
       </w:pPr>
       <w:bookmarkStart w:id="1" w:name="_Toc241509692"/>
       <w:r>
-        <w:lastRenderedPageBreak/>
         <w:t>Acknowledgment</w:t>
       </w:r>
       <w:bookmarkEnd w:id="1"/>
@@ -752,7 +884,49 @@
         <w:ind w:firstLine="720"/>
       </w:pPr>
       <w:r>
-        <w:t>First and foremost, I would like to extend my deepest appreciation to my supervisors, [Supervisor 1] and [Supervisor 2], for their invaluable guidance, constructive feedback, and constant support during my time at ESI Algiers. Their expertise and direction were instrumental in the successful completion of this project.</w:t>
+        <w:t xml:space="preserve">First and foremost, I would like to extend my deepest appreciation to my supervisors, </w:t>
+      </w:r>
+      <w:proofErr w:type="spellStart"/>
+      <w:r>
+        <w:rPr>
+          <w:rFonts w:cs="CMU Serif"/>
+        </w:rPr>
+        <w:t>Mme.</w:t>
+      </w:r>
+      <w:proofErr w:type="spellEnd"/>
+      <w:r>
+        <w:rPr>
+          <w:rFonts w:cs="CMU Serif"/>
+        </w:rPr>
+        <w:t xml:space="preserve"> BENATCHBA Karima</w:t>
+      </w:r>
+      <w:r>
+        <w:t xml:space="preserve"> and </w:t>
+      </w:r>
+      <w:proofErr w:type="spellStart"/>
+      <w:r>
+        <w:rPr>
+          <w:rFonts w:cs="CMU Serif"/>
+        </w:rPr>
+        <w:t>Mme.</w:t>
+      </w:r>
+      <w:proofErr w:type="spellEnd"/>
+      <w:r>
+        <w:rPr>
+          <w:rFonts w:cs="CMU Serif"/>
+        </w:rPr>
+        <w:t xml:space="preserve"> SADEG </w:t>
+      </w:r>
+      <w:proofErr w:type="spellStart"/>
+      <w:r>
+        <w:rPr>
+          <w:rFonts w:cs="CMU Serif"/>
+        </w:rPr>
+        <w:t>Souhila</w:t>
+      </w:r>
+      <w:proofErr w:type="spellEnd"/>
+      <w:r>
+        <w:t>, for their invaluable guidance, constructive feedback, and constant support during my time at ESI Algiers. Their expertise and direction were instrumental in the successful completion of this project.</w:t>
       </w:r>
     </w:p>
     <w:p>
@@ -5304,7 +5478,21 @@
         <w:rPr>
           <w:b/>
         </w:rPr>
-        <w:t>Structure of Arrays (SoA):</w:t>
+        <w:t>Structure of Arrays (</w:t>
+      </w:r>
+      <w:proofErr w:type="spellStart"/>
+      <w:r>
+        <w:rPr>
+          <w:b/>
+        </w:rPr>
+        <w:t>SoA</w:t>
+      </w:r>
+      <w:proofErr w:type="spellEnd"/>
+      <w:r>
+        <w:rPr>
+          <w:b/>
+        </w:rPr>
+        <w:t>):</w:t>
       </w:r>
       <w:r>
         <w:rPr>
@@ -5313,7 +5501,15 @@
         <w:t xml:space="preserve"> </w:t>
       </w:r>
       <w:r>
-        <w:t>A memory layout optimization technique where data attributes are stored in separate parallel arrays rather than an array of structures (AoS), maximizing CPU cache efficiency and vectorization performance.</w:t>
+        <w:t>A memory layout optimization technique where data attributes are stored in separate parallel arrays rather than an array of structures (</w:t>
+      </w:r>
+      <w:proofErr w:type="spellStart"/>
+      <w:r>
+        <w:t>AoS</w:t>
+      </w:r>
+      <w:proofErr w:type="spellEnd"/>
+      <w:r>
+        <w:t>), maximizing CPU cache efficiency and vectorization performance.</w:t>
       </w:r>
     </w:p>
     <w:p>
@@ -5331,7 +5527,21 @@
         <w:rPr>
           <w:b/>
         </w:rPr>
-        <w:t>Array of Structures (AoS):</w:t>
+        <w:t>Array of Structures (</w:t>
+      </w:r>
+      <w:proofErr w:type="spellStart"/>
+      <w:r>
+        <w:rPr>
+          <w:b/>
+        </w:rPr>
+        <w:t>AoS</w:t>
+      </w:r>
+      <w:proofErr w:type="spellEnd"/>
+      <w:r>
+        <w:rPr>
+          <w:b/>
+        </w:rPr>
+        <w:t>):</w:t>
       </w:r>
       <w:r>
         <w:rPr>
@@ -5428,13 +5638,47 @@
       <w:r>
         <w:t xml:space="preserve">To address these challenges, the </w:t>
       </w:r>
+      <w:proofErr w:type="spellStart"/>
       <w:r>
         <w:rPr>
           <w:i/>
           <w:iCs/>
         </w:rPr>
-        <w:t>Laboratoire de Méthodes de Conception des Systèmes</w:t>
-      </w:r>
+        <w:t>Laboratoire</w:t>
+      </w:r>
+      <w:proofErr w:type="spellEnd"/>
+      <w:r>
+        <w:rPr>
+          <w:i/>
+          <w:iCs/>
+        </w:rPr>
+        <w:t xml:space="preserve"> de </w:t>
+      </w:r>
+      <w:proofErr w:type="spellStart"/>
+      <w:r>
+        <w:rPr>
+          <w:i/>
+          <w:iCs/>
+        </w:rPr>
+        <w:t>Méthodes</w:t>
+      </w:r>
+      <w:proofErr w:type="spellEnd"/>
+      <w:r>
+        <w:rPr>
+          <w:i/>
+          <w:iCs/>
+        </w:rPr>
+        <w:t xml:space="preserve"> de Conception des </w:t>
+      </w:r>
+      <w:proofErr w:type="spellStart"/>
+      <w:r>
+        <w:rPr>
+          <w:i/>
+          <w:iCs/>
+        </w:rPr>
+        <w:t>Systèmes</w:t>
+      </w:r>
+      <w:proofErr w:type="spellEnd"/>
       <w:r>
         <w:t xml:space="preserve"> (LMCS) at the Higher National School of Computer Science (ESI – Algiers) hosted this academic internship. The project focuses on building an interactive educational tool designed to bridge the gap between theory and practice. The system provides visual representations of automata execution, an algebraic and algorithmic approach to building and testing machines, real-time graphical graphing, and implementations of fundamental formal language transformations. Finally, the tool incorporates a modern AI tutoring assistant to help students navigate theoretical concepts, debugging, and automata simulation.</w:t>
       </w:r>
@@ -5501,11 +5745,19 @@
         </w:rPr>
       </w:pPr>
       <w:bookmarkStart w:id="8" w:name="_Toc241509699"/>
+      <w:proofErr w:type="spellStart"/>
       <w:r>
         <w:rPr>
           <w:lang w:val="fr-FR"/>
         </w:rPr>
-        <w:t>Presentation of LMCS</w:t>
+        <w:t>Presentation</w:t>
+      </w:r>
+      <w:proofErr w:type="spellEnd"/>
+      <w:r>
+        <w:rPr>
+          <w:lang w:val="fr-FR"/>
+        </w:rPr>
+        <w:t xml:space="preserve"> of LMCS</w:t>
       </w:r>
       <w:bookmarkEnd w:id="8"/>
     </w:p>
@@ -5788,7 +6040,63 @@
         <w:rPr>
           <w:lang w:val="fr-FR"/>
         </w:rPr>
-        <w:t xml:space="preserve"> (LMCS) is a research laboratory attached to the École Nationale Supérieure d</w:t>
+        <w:t xml:space="preserve"> (LMCS) </w:t>
+      </w:r>
+      <w:proofErr w:type="spellStart"/>
+      <w:r>
+        <w:rPr>
+          <w:lang w:val="fr-FR"/>
+        </w:rPr>
+        <w:t>is</w:t>
+      </w:r>
+      <w:proofErr w:type="spellEnd"/>
+      <w:r>
+        <w:rPr>
+          <w:lang w:val="fr-FR"/>
+        </w:rPr>
+        <w:t xml:space="preserve"> a </w:t>
+      </w:r>
+      <w:proofErr w:type="spellStart"/>
+      <w:r>
+        <w:rPr>
+          <w:lang w:val="fr-FR"/>
+        </w:rPr>
+        <w:t>research</w:t>
+      </w:r>
+      <w:proofErr w:type="spellEnd"/>
+      <w:r>
+        <w:rPr>
+          <w:lang w:val="fr-FR"/>
+        </w:rPr>
+        <w:t xml:space="preserve"> </w:t>
+      </w:r>
+      <w:proofErr w:type="spellStart"/>
+      <w:r>
+        <w:rPr>
+          <w:lang w:val="fr-FR"/>
+        </w:rPr>
+        <w:t>laboratory</w:t>
+      </w:r>
+      <w:proofErr w:type="spellEnd"/>
+      <w:r>
+        <w:rPr>
+          <w:lang w:val="fr-FR"/>
+        </w:rPr>
+        <w:t xml:space="preserve"> </w:t>
+      </w:r>
+      <w:proofErr w:type="spellStart"/>
+      <w:r>
+        <w:rPr>
+          <w:lang w:val="fr-FR"/>
+        </w:rPr>
+        <w:t>attached</w:t>
+      </w:r>
+      <w:proofErr w:type="spellEnd"/>
+      <w:r>
+        <w:rPr>
+          <w:lang w:val="fr-FR"/>
+        </w:rPr>
+        <w:t xml:space="preserve"> to the École Nationale Supérieure d</w:t>
       </w:r>
       <w:r>
         <w:rPr>
@@ -6682,6 +6990,7 @@
         </w:rPr>
         <w:t xml:space="preserve">Industrial Frameworks (e.g., </w:t>
       </w:r>
+      <w:proofErr w:type="spellStart"/>
       <w:r>
         <w:rPr>
           <w:rFonts w:cs="CMU Serif"/>
@@ -6692,6 +7001,7 @@
         </w:rPr>
         <w:t>OpenFST</w:t>
       </w:r>
+      <w:proofErr w:type="spellEnd"/>
       <w:r>
         <w:rPr>
           <w:rFonts w:cs="CMU Serif"/>
@@ -6704,7 +7014,21 @@
         <w:rPr>
           <w:rFonts w:cs="CMU Serif"/>
         </w:rPr>
-        <w:t xml:space="preserve"> Built in C++ by Google and NYU primarily for speech recognition and machine learning, OpenFST is robust and performant. Yet, its extreme complexity and rigid focus on industrial and research applications make it a utility backend rather than an interactive visualization and simulation tool for students</w:t>
+        <w:t xml:space="preserve"> Built in C++ by Google and NYU primarily for speech recognition and machine learning, </w:t>
+      </w:r>
+      <w:proofErr w:type="spellStart"/>
+      <w:r>
+        <w:rPr>
+          <w:rFonts w:cs="CMU Serif"/>
+        </w:rPr>
+        <w:t>OpenFST</w:t>
+      </w:r>
+      <w:proofErr w:type="spellEnd"/>
+      <w:r>
+        <w:rPr>
+          <w:rFonts w:cs="CMU Serif"/>
+        </w:rPr>
+        <w:t xml:space="preserve"> is robust and performant. Yet, its extreme complexity and rigid focus on industrial and research applications make it a utility backend rather than an interactive visualization and simulation tool for students</w:t>
       </w:r>
       <w:sdt>
         <w:sdtPr>
@@ -6959,7 +7283,21 @@
         <w:rPr>
           <w:rFonts w:cs="CMU Serif"/>
         </w:rPr>
-        <w:t>To guide the development of the simulator and address the pedagogical challenges outlined in the problem statement, the project was structured around clear, SMART objectives. Specifically, the goal was to design and develop a web-based educational simulator capable of parsing, visualizing, and executing multiple formal models—including Finite State Automata, Pushdown Automata, Linear Bounded Automata, and Turing Machines—while accommodating local academic formalisms such as 4-tuple instructions and unary bar notations. To make this measurable, the tool delivers a performant client-side application featuring real-time SVG graph rendering, concurrent non-deterministic branch evaluation using a Structure of Arrays (SoA) layout, a full history/replay navigation system, and an integrated AI debugging assistant. Achievability was ensured by leveraging a modern, type-safe technology stack consisting of TypeScript, React, and Tailwind CSS alongside a modular M19 engine architecture that maintains high code reusability and execution efficiency. This work is directly relevant to bridging the theory-practice gap for 3</w:t>
+        <w:t>To guide the development of the simulator and address the pedagogical challenges outlined in the problem statement, the project was structured around clear, SMART objectives. Specifically, the goal was to design and develop a web-based educational simulator capable of parsing, visualizing, and executing multiple formal models—including Finite State Automata, Pushdown Automata, Linear Bounded Automata, and Turing Machines—while accommodating local academic formalisms such as 4-tuple instructions and unary bar notations. To make this measurable, the tool delivers a performant client-side application featuring real-time SVG graph rendering, concurrent non-deterministic branch evaluation using a Structure of Arrays (</w:t>
+      </w:r>
+      <w:proofErr w:type="spellStart"/>
+      <w:r>
+        <w:rPr>
+          <w:rFonts w:cs="CMU Serif"/>
+        </w:rPr>
+        <w:t>SoA</w:t>
+      </w:r>
+      <w:proofErr w:type="spellEnd"/>
+      <w:r>
+        <w:rPr>
+          <w:rFonts w:cs="CMU Serif"/>
+        </w:rPr>
+        <w:t>) layout, a full history/replay navigation system, and an integrated AI debugging assistant. Achievability was ensured by leveraging a modern, type-safe technology stack consisting of TypeScript, React, and Tailwind CSS alongside a modular M19 engine architecture that maintains high code reusability and execution efficiency. This work is directly relevant to bridging the theory-practice gap for 3</w:t>
       </w:r>
       <w:r>
         <w:rPr>
@@ -7491,7 +7829,21 @@
         <w:rPr>
           <w:rFonts w:ascii="Georgia" w:hAnsi="Georgia"/>
         </w:rPr>
-        <w:t>The M19 engine had to be both performant and flexible. To achieve this, we decided to adopt a Structure of Arrays (SoA) approach for data management within the engine. This approach has been shown to provide improved cache locality for certain workloads, reducing the frequency of cache misses and, consequently, the time spent waiting for data to be retrieved from main memory. [Citation]</w:t>
+        <w:t>The M19 engine had to be both performant and flexible. To achieve this, we decided to adopt a Structure of Arrays (</w:t>
+      </w:r>
+      <w:proofErr w:type="spellStart"/>
+      <w:r>
+        <w:rPr>
+          <w:rFonts w:ascii="Georgia" w:hAnsi="Georgia"/>
+        </w:rPr>
+        <w:t>SoA</w:t>
+      </w:r>
+      <w:proofErr w:type="spellEnd"/>
+      <w:r>
+        <w:rPr>
+          <w:rFonts w:ascii="Georgia" w:hAnsi="Georgia"/>
+        </w:rPr>
+        <w:t>) approach for data management within the engine. This approach has been shown to provide improved cache locality for certain workloads, reducing the frequency of cache misses and, consequently, the time spent waiting for data to be retrieved from main memory. [Citation]</w:t>
       </w:r>
     </w:p>
     <w:p>
@@ -7697,8 +8049,13 @@
         <w:t></w:t>
       </w:r>
       <w:r>
-        <w:t xml:space="preserve"> Degeneralisation</w:t>
-      </w:r>
+        <w:t xml:space="preserve"> </w:t>
+      </w:r>
+      <w:proofErr w:type="spellStart"/>
+      <w:r>
+        <w:t>Degeneralisation</w:t>
+      </w:r>
+      <w:proofErr w:type="spellEnd"/>
       <w:r>
         <w:rPr>
           <w:b/>
@@ -7815,13 +8172,21 @@
         <w:t>Automaton to Regular Expression:</w:t>
       </w:r>
       <w:r>
-        <w:t xml:space="preserve"> Extracts a regular expression from a finite automaton using state elimination (Brzozowski</w:t>
+        <w:t xml:space="preserve"> Extracts a regular expression from a finite automaton using state elimination (</w:t>
+      </w:r>
+      <w:proofErr w:type="spellStart"/>
+      <w:r>
+        <w:t>Brzozowski</w:t>
       </w:r>
       <w:r>
         <w:t>’</w:t>
       </w:r>
       <w:r>
-        <w:t>s algebraic method or Arden</w:t>
+        <w:t>s</w:t>
+      </w:r>
+      <w:proofErr w:type="spellEnd"/>
+      <w:r>
+        <w:t xml:space="preserve"> algebraic method or Arden</w:t>
       </w:r>
       <w:r>
         <w:t>’</w:t>
@@ -7973,12 +8338,14 @@
         </w:rPr>
         <w:t>“</w:t>
       </w:r>
+      <w:proofErr w:type="spellStart"/>
       <w:r>
         <w:rPr>
           <w:rFonts w:ascii="Georgia" w:hAnsi="Georgia"/>
         </w:rPr>
         <w:t>ParsingManager</w:t>
       </w:r>
+      <w:proofErr w:type="spellEnd"/>
       <w:r>
         <w:rPr>
           <w:rFonts w:ascii="Georgia" w:hAnsi="Georgia"/>
@@ -8009,12 +8376,14 @@
         </w:rPr>
         <w:t>“</w:t>
       </w:r>
+      <w:proofErr w:type="spellStart"/>
       <w:r>
         <w:rPr>
           <w:rFonts w:ascii="Georgia" w:hAnsi="Georgia"/>
         </w:rPr>
         <w:t>ExecutionManager</w:t>
       </w:r>
+      <w:proofErr w:type="spellEnd"/>
       <w:r>
         <w:rPr>
           <w:rFonts w:ascii="Georgia" w:hAnsi="Georgia"/>
@@ -8160,7 +8529,23 @@
         <w:ind w:firstLine="720"/>
       </w:pPr>
       <w:r>
-        <w:t>To achieve this, the system implements a specialized engine API mediated through custom React hooks (Automata Hook) and orchestration managers (Engine.ts, InstanceManager.ts). This API establishes a clear contract:</w:t>
+        <w:t>To achieve this, the system implements a specialized engine API mediated through custom React hooks (Automata Hook) and orchestration managers (</w:t>
+      </w:r>
+      <w:proofErr w:type="spellStart"/>
+      <w:r>
+        <w:t>Engine.ts</w:t>
+      </w:r>
+      <w:proofErr w:type="spellEnd"/>
+      <w:r>
+        <w:t xml:space="preserve">, </w:t>
+      </w:r>
+      <w:proofErr w:type="spellStart"/>
+      <w:r>
+        <w:t>InstanceManager.ts</w:t>
+      </w:r>
+      <w:proofErr w:type="spellEnd"/>
+      <w:r>
+        <w:t>). This API establishes a clear contract:</w:t>
       </w:r>
     </w:p>
     <w:p>
@@ -8179,11 +8564,27 @@
         <w:t>Request &amp; Control Flow:</w:t>
       </w:r>
       <w:r>
-        <w:t xml:space="preserve"> The frontend dispatches user-driven intents—such as parsing DSL code via the ParsingManager, initiating execution steps, </w:t>
+        <w:t xml:space="preserve"> The frontend dispatches user-driven intents—such as parsing DSL code via the </w:t>
+      </w:r>
+      <w:proofErr w:type="spellStart"/>
+      <w:r>
+        <w:t>ParsingManager</w:t>
+      </w:r>
+      <w:proofErr w:type="spellEnd"/>
+      <w:r>
+        <w:t xml:space="preserve">, initiating execution steps, </w:t>
       </w:r>
       <w:r>
         <w:lastRenderedPageBreak/>
-        <w:t>or applying tape/stack alterations (applyChanges.ts)—down to the orchestration layer.</w:t>
+        <w:t>or applying tape/stack alterations (</w:t>
+      </w:r>
+      <w:proofErr w:type="spellStart"/>
+      <w:r>
+        <w:t>applyChanges.ts</w:t>
+      </w:r>
+      <w:proofErr w:type="spellEnd"/>
+      <w:r>
+        <w:t>)—down to the orchestration layer.</w:t>
       </w:r>
     </w:p>
     <w:p>
@@ -8202,7 +8603,23 @@
         <w:t>Observability &amp; State Dispatch:</w:t>
       </w:r>
       <w:r>
-        <w:t xml:space="preserve"> Conversely, the engine exposes controlled state snapshots to the UI layers (ExecSpace.ts, graph visualizers, and tape/stack views). Rather than allowing arbitrary direct mutations, the engine yields structured execution states and branch results that the frontend uses to render real-time transitions, highlight active states, and track step completion (computeEOI.ts).</w:t>
+        <w:t xml:space="preserve"> Conversely, the engine exposes controlled state snapshots to the UI layers (</w:t>
+      </w:r>
+      <w:proofErr w:type="spellStart"/>
+      <w:r>
+        <w:t>ExecSpace.ts</w:t>
+      </w:r>
+      <w:proofErr w:type="spellEnd"/>
+      <w:r>
+        <w:t>, graph visualizers, and tape/stack views). Rather than allowing arbitrary direct mutations, the engine yields structured execution states and branch results that the frontend uses to render real-time transitions, highlight active states, and track step completion (</w:t>
+      </w:r>
+      <w:proofErr w:type="spellStart"/>
+      <w:r>
+        <w:t>computeEOI.ts</w:t>
+      </w:r>
+      <w:proofErr w:type="spellEnd"/>
+      <w:r>
+        <w:t>).</w:t>
       </w:r>
     </w:p>
     <w:p>
@@ -8430,7 +8847,15 @@
         <w:t>History &amp; Replay Management:</w:t>
       </w:r>
       <w:r>
-        <w:t xml:space="preserve"> The communication layer hooks directly into the HistoryManager, allowing the frontend to request historical snapshots, step backward/forward, or inspect previous execution states without re-running the underlying machine logic.</w:t>
+        <w:t xml:space="preserve"> The communication layer hooks directly into the </w:t>
+      </w:r>
+      <w:proofErr w:type="spellStart"/>
+      <w:r>
+        <w:t>HistoryManager</w:t>
+      </w:r>
+      <w:proofErr w:type="spellEnd"/>
+      <w:r>
+        <w:t>, allowing the frontend to request historical snapshots, step backward/forward, or inspect previous execution states without re-running the underlying machine logic.</w:t>
       </w:r>
       <w:r>
         <w:t xml:space="preserve"> The following </w:t>
@@ -8485,7 +8910,23 @@
           <w:b/>
           <w:bCs/>
         </w:rPr>
-        <w:t>Structure of Arrays (SoA) Layout:</w:t>
+        <w:t>Structure of Arrays (</w:t>
+      </w:r>
+      <w:proofErr w:type="spellStart"/>
+      <w:r>
+        <w:rPr>
+          <w:b/>
+          <w:bCs/>
+        </w:rPr>
+        <w:t>SoA</w:t>
+      </w:r>
+      <w:proofErr w:type="spellEnd"/>
+      <w:r>
+        <w:rPr>
+          <w:b/>
+          <w:bCs/>
+        </w:rPr>
+        <w:t>) Layout:</w:t>
       </w:r>
       <w:r>
         <w:t xml:space="preserve"> To optimize memory access patterns and hardware cache locality during concurrent state execution, core data </w:t>
@@ -8511,7 +8952,39 @@
         <w:t>Optimized Graph &amp; State Representations:</w:t>
       </w:r>
       <w:r>
-        <w:t xml:space="preserve"> Automata definitions (nodes, transitions, tape symbols, and stack headers) are stored in lightweight, immutable-friendly schemas that allow the ParsingManager and parsers (FSAParser.ts, PDAParser.ts, LBAParser.ts) to quickly construct and validate formal machine definitions.</w:t>
+        <w:t xml:space="preserve"> Automata definitions (nodes, transitions, tape symbols, and stack headers) are stored in lightweight, immutable-friendly schemas that allow the </w:t>
+      </w:r>
+      <w:proofErr w:type="spellStart"/>
+      <w:r>
+        <w:t>ParsingManager</w:t>
+      </w:r>
+      <w:proofErr w:type="spellEnd"/>
+      <w:r>
+        <w:t xml:space="preserve"> and parsers (</w:t>
+      </w:r>
+      <w:proofErr w:type="spellStart"/>
+      <w:r>
+        <w:t>FSAParser.ts</w:t>
+      </w:r>
+      <w:proofErr w:type="spellEnd"/>
+      <w:r>
+        <w:t xml:space="preserve">, </w:t>
+      </w:r>
+      <w:proofErr w:type="spellStart"/>
+      <w:r>
+        <w:t>PDAParser.ts</w:t>
+      </w:r>
+      <w:proofErr w:type="spellEnd"/>
+      <w:r>
+        <w:t xml:space="preserve">, </w:t>
+      </w:r>
+      <w:proofErr w:type="spellStart"/>
+      <w:r>
+        <w:t>LBAParser.ts</w:t>
+      </w:r>
+      <w:proofErr w:type="spellEnd"/>
+      <w:r>
+        <w:t>) to quickly construct and validate formal machine definitions.</w:t>
       </w:r>
     </w:p>
     <w:p>
@@ -8530,7 +9003,23 @@
         <w:t>Decoupled Rendering and Runtime:</w:t>
       </w:r>
       <w:r>
-        <w:t xml:space="preserve"> State updates processed by the Engine are decoupled from React’s virtual DOM reconciliation cycle where necessary. State modifications are buffered through optimized hooks, ensuring that high-speed execution loops and step-by-step animations remain fluid without blocking user interaction in the IDE.tsx or settings panels.</w:t>
+        <w:t xml:space="preserve"> State updates processed by the Engine are decoupled from </w:t>
+      </w:r>
+      <w:proofErr w:type="spellStart"/>
+      <w:r>
+        <w:t>React’s</w:t>
+      </w:r>
+      <w:proofErr w:type="spellEnd"/>
+      <w:r>
+        <w:t xml:space="preserve"> virtual DOM reconciliation cycle where necessary. State modifications are buffered through optimized hooks, ensuring that high-speed execution loops and step-by-step animations remain fluid without blocking user interaction in the </w:t>
+      </w:r>
+      <w:proofErr w:type="spellStart"/>
+      <w:r>
+        <w:t>IDE.tsx</w:t>
+      </w:r>
+      <w:proofErr w:type="spellEnd"/>
+      <w:r>
+        <w:t xml:space="preserve"> or settings panels.</w:t>
       </w:r>
     </w:p>
     <w:p>
@@ -9249,12 +9738,21 @@
                 <w:szCs w:val="22"/>
               </w:rPr>
             </w:pPr>
+            <w:proofErr w:type="spellStart"/>
             <w:r>
               <w:rPr>
                 <w:sz w:val="22"/>
                 <w:szCs w:val="22"/>
               </w:rPr>
-              <w:t>Groq Cloud API</w:t>
+              <w:t>Groq</w:t>
+            </w:r>
+            <w:proofErr w:type="spellEnd"/>
+            <w:r>
+              <w:rPr>
+                <w:sz w:val="22"/>
+                <w:szCs w:val="22"/>
+              </w:rPr>
+              <w:t xml:space="preserve"> Cloud API</w:t>
             </w:r>
           </w:p>
         </w:tc>
@@ -9391,12 +9889,21 @@
                 <w:szCs w:val="22"/>
               </w:rPr>
             </w:pPr>
+            <w:proofErr w:type="spellStart"/>
             <w:r>
               <w:rPr>
                 <w:sz w:val="22"/>
                 <w:szCs w:val="22"/>
               </w:rPr>
-              <w:t>DeepSeek V3</w:t>
+              <w:t>DeepSeek</w:t>
+            </w:r>
+            <w:proofErr w:type="spellEnd"/>
+            <w:r>
+              <w:rPr>
+                <w:sz w:val="22"/>
+                <w:szCs w:val="22"/>
+              </w:rPr>
+              <w:t xml:space="preserve"> V3</w:t>
             </w:r>
           </w:p>
         </w:tc>
@@ -11664,7 +12171,23 @@
           <w:b/>
           <w:bCs/>
         </w:rPr>
-        <w:t>Unified Parsing Manager (ParsingManager.ts):</w:t>
+        <w:t>Unified Parsing Manager (</w:t>
+      </w:r>
+      <w:proofErr w:type="spellStart"/>
+      <w:r>
+        <w:rPr>
+          <w:b/>
+          <w:bCs/>
+        </w:rPr>
+        <w:t>ParsingManager.ts</w:t>
+      </w:r>
+      <w:proofErr w:type="spellEnd"/>
+      <w:r>
+        <w:rPr>
+          <w:b/>
+          <w:bCs/>
+        </w:rPr>
+        <w:t>):</w:t>
       </w:r>
       <w:r>
         <w:t xml:space="preserve"> Serves as the primary entry point for user-authored text, routing input code to specialized parsers depending on the selected theoretical computing model.</w:t>
@@ -11686,7 +12209,31 @@
         <w:t>Model-Specific Parsers:</w:t>
       </w:r>
       <w:r>
-        <w:t xml:space="preserve"> Specialized parsers (FSAParser.ts, PDAParser.ts, LBAParser.ts, and Turing Machine parsers) tokenize and validate custom Domain-Specific Language (DSL) scripts, converting plain text rules into robust internal formal machine representations.</w:t>
+        <w:t xml:space="preserve"> Specialized parsers (</w:t>
+      </w:r>
+      <w:proofErr w:type="spellStart"/>
+      <w:r>
+        <w:t>FSAParser.ts</w:t>
+      </w:r>
+      <w:proofErr w:type="spellEnd"/>
+      <w:r>
+        <w:t xml:space="preserve">, </w:t>
+      </w:r>
+      <w:proofErr w:type="spellStart"/>
+      <w:r>
+        <w:t>PDAParser.ts</w:t>
+      </w:r>
+      <w:proofErr w:type="spellEnd"/>
+      <w:r>
+        <w:t xml:space="preserve">, </w:t>
+      </w:r>
+      <w:proofErr w:type="spellStart"/>
+      <w:r>
+        <w:t>LBAParser.ts</w:t>
+      </w:r>
+      <w:proofErr w:type="spellEnd"/>
+      <w:r>
+        <w:t>, and Turing Machine parsers) tokenize and validate custom Domain-Specific Language (DSL) scripts, converting plain text rules into robust internal formal machine representations.</w:t>
       </w:r>
     </w:p>
     <w:p>
@@ -11705,7 +12252,23 @@
         <w:t>Code Cleaning and Error Handling:</w:t>
       </w:r>
       <w:r>
-        <w:t xml:space="preserve"> Auxiliary cleaning services (CleaningService.ts) strip comments, normalize whitespace, and provide syntax validation feedback directly back to the IDE.tsx editor component.</w:t>
+        <w:t xml:space="preserve"> Auxiliary cleaning services (</w:t>
+      </w:r>
+      <w:proofErr w:type="spellStart"/>
+      <w:r>
+        <w:t>CleaningService.ts</w:t>
+      </w:r>
+      <w:proofErr w:type="spellEnd"/>
+      <w:r>
+        <w:t xml:space="preserve">) strip comments, normalize whitespace, and provide syntax validation feedback directly back to the </w:t>
+      </w:r>
+      <w:proofErr w:type="spellStart"/>
+      <w:r>
+        <w:t>IDE.tsx</w:t>
+      </w:r>
+      <w:proofErr w:type="spellEnd"/>
+      <w:r>
+        <w:t xml:space="preserve"> editor component.</w:t>
       </w:r>
     </w:p>
     <w:p>
@@ -11750,7 +12313,23 @@
           <w:b/>
           <w:bCs/>
         </w:rPr>
-        <w:t>Non-Deterministic Branching (InstanceManager.ts):</w:t>
+        <w:t>Non-Deterministic Branching (</w:t>
+      </w:r>
+      <w:proofErr w:type="spellStart"/>
+      <w:r>
+        <w:rPr>
+          <w:b/>
+          <w:bCs/>
+        </w:rPr>
+        <w:t>InstanceManager.ts</w:t>
+      </w:r>
+      <w:proofErr w:type="spellEnd"/>
+      <w:r>
+        <w:rPr>
+          <w:b/>
+          <w:bCs/>
+        </w:rPr>
+        <w:t>):</w:t>
       </w:r>
       <w:r>
         <w:t xml:space="preserve"> Manages concurrent execution paths for non-deterministic machines, assigning unique instance IDs to track parallel evaluation branches without freezing the main thread.</w:t>
@@ -11769,10 +12348,42 @@
           <w:b/>
           <w:bCs/>
         </w:rPr>
-        <w:t>State Transition Engine (Engine.ts):</w:t>
-      </w:r>
-      <w:r>
-        <w:t xml:space="preserve"> Evaluates active machine states against current tape heads, stack frames, and transition rules, applying updates via dedicated modifiers (applyChanges.ts, computeEOI.ts).</w:t>
+        <w:t>State Transition Engine (</w:t>
+      </w:r>
+      <w:proofErr w:type="spellStart"/>
+      <w:r>
+        <w:rPr>
+          <w:b/>
+          <w:bCs/>
+        </w:rPr>
+        <w:t>Engine.ts</w:t>
+      </w:r>
+      <w:proofErr w:type="spellEnd"/>
+      <w:r>
+        <w:rPr>
+          <w:b/>
+          <w:bCs/>
+        </w:rPr>
+        <w:t>):</w:t>
+      </w:r>
+      <w:r>
+        <w:t xml:space="preserve"> Evaluates active machine states against current tape heads, stack frames, and transition rules, applying updates via dedicated modifiers (</w:t>
+      </w:r>
+      <w:proofErr w:type="spellStart"/>
+      <w:r>
+        <w:t>applyChanges.ts</w:t>
+      </w:r>
+      <w:proofErr w:type="spellEnd"/>
+      <w:r>
+        <w:t xml:space="preserve">, </w:t>
+      </w:r>
+      <w:proofErr w:type="spellStart"/>
+      <w:r>
+        <w:t>computeEOI.ts</w:t>
+      </w:r>
+      <w:proofErr w:type="spellEnd"/>
+      <w:r>
+        <w:t>).</w:t>
       </w:r>
     </w:p>
     <w:p>
@@ -11799,7 +12410,23 @@
           <w:b/>
           <w:bCs/>
         </w:rPr>
-        <w:t>Application Shell (App.tsx):</w:t>
+        <w:t>Application Shell (</w:t>
+      </w:r>
+      <w:proofErr w:type="spellStart"/>
+      <w:r>
+        <w:rPr>
+          <w:b/>
+          <w:bCs/>
+        </w:rPr>
+        <w:t>App.tsx</w:t>
+      </w:r>
+      <w:proofErr w:type="spellEnd"/>
+      <w:r>
+        <w:rPr>
+          <w:b/>
+          <w:bCs/>
+        </w:rPr>
+        <w:t>):</w:t>
       </w:r>
       <w:r>
         <w:t xml:space="preserve"> Coordinates global state distribution, passing tape states</w:t>
@@ -12207,7 +12834,7 @@
           <w:noProof/>
         </w:rPr>
         <w:drawing>
-          <wp:anchor distT="0" distB="0" distL="114300" distR="114300" simplePos="0" relativeHeight="251678720" behindDoc="0" locked="0" layoutInCell="1" allowOverlap="1" wp14:anchorId="6FBD9DE4" wp14:editId="40744B18">
+          <wp:anchor distT="0" distB="0" distL="114300" distR="114300" simplePos="0" relativeHeight="251678720" behindDoc="0" locked="0" layoutInCell="1" allowOverlap="1" wp14:anchorId="6FBD9DE4" wp14:editId="30B1A80B">
             <wp:simplePos x="0" y="0"/>
             <wp:positionH relativeFrom="column">
               <wp:posOffset>81280</wp:posOffset>
@@ -12341,7 +12968,7 @@
           <w:noProof/>
         </w:rPr>
         <w:drawing>
-          <wp:anchor distT="0" distB="0" distL="114300" distR="114300" simplePos="0" relativeHeight="251680768" behindDoc="0" locked="0" layoutInCell="1" allowOverlap="1" wp14:anchorId="56F74D1A" wp14:editId="6CDB9F1F">
+          <wp:anchor distT="0" distB="0" distL="114300" distR="114300" simplePos="0" relativeHeight="251680768" behindDoc="0" locked="0" layoutInCell="1" allowOverlap="1" wp14:anchorId="56F74D1A" wp14:editId="149EF1DF">
             <wp:simplePos x="0" y="0"/>
             <wp:positionH relativeFrom="column">
               <wp:posOffset>4018569</wp:posOffset>
@@ -12429,7 +13056,7 @@
         </w:rPr>
         <w:lastRenderedPageBreak/>
         <w:drawing>
-          <wp:anchor distT="0" distB="0" distL="114300" distR="114300" simplePos="0" relativeHeight="251664384" behindDoc="0" locked="0" layoutInCell="1" allowOverlap="1" wp14:anchorId="1836C474" wp14:editId="58029AE9">
+          <wp:anchor distT="0" distB="0" distL="114300" distR="114300" simplePos="0" relativeHeight="251664384" behindDoc="0" locked="0" layoutInCell="1" allowOverlap="1" wp14:anchorId="1836C474" wp14:editId="02085484">
             <wp:simplePos x="0" y="0"/>
             <wp:positionH relativeFrom="column">
               <wp:posOffset>618067</wp:posOffset>
@@ -12638,7 +13265,7 @@
           <w:noProof/>
         </w:rPr>
         <w:drawing>
-          <wp:anchor distT="0" distB="0" distL="114300" distR="114300" simplePos="0" relativeHeight="251665408" behindDoc="0" locked="0" layoutInCell="1" allowOverlap="1" wp14:anchorId="413D0D1B" wp14:editId="4948CEEF">
+          <wp:anchor distT="0" distB="0" distL="114300" distR="114300" simplePos="0" relativeHeight="251665408" behindDoc="0" locked="0" layoutInCell="1" allowOverlap="1" wp14:anchorId="413D0D1B" wp14:editId="58F31F65">
             <wp:simplePos x="0" y="0"/>
             <wp:positionH relativeFrom="column">
               <wp:posOffset>618067</wp:posOffset>
@@ -12702,7 +13329,23 @@
         <w:t>Interactive Visualizers:</w:t>
       </w:r>
       <w:r>
-        <w:t xml:space="preserve"> Real-time graph renderers (FSAGraph.tsx, LBAGraph.tsx) leverage SVG graphics to dynamically display node transitions, active states, and machine configurations.</w:t>
+        <w:t xml:space="preserve"> Real-time graph renderers (</w:t>
+      </w:r>
+      <w:proofErr w:type="spellStart"/>
+      <w:r>
+        <w:t>FSAGraph.tsx</w:t>
+      </w:r>
+      <w:proofErr w:type="spellEnd"/>
+      <w:r>
+        <w:t xml:space="preserve">, </w:t>
+      </w:r>
+      <w:proofErr w:type="spellStart"/>
+      <w:r>
+        <w:t>LBAGraph.tsx</w:t>
+      </w:r>
+      <w:proofErr w:type="spellEnd"/>
+      <w:r>
+        <w:t>) leverage SVG graphics to dynamically display node transitions, active states, and machine configurations.</w:t>
       </w:r>
       <w:r>
         <w:rPr>
@@ -12727,7 +13370,15 @@
         <w:t>Inspection Panels:</w:t>
       </w:r>
       <w:r>
-        <w:t xml:space="preserve"> Dedicated views—including the Tape View and History Manager (HistoryManager.ts)—allow users to step forward and backward through execution history, inspect past states, and export graphical outputs.</w:t>
+        <w:t xml:space="preserve"> Dedicated views—including the Tape View and History Manager (</w:t>
+      </w:r>
+      <w:proofErr w:type="spellStart"/>
+      <w:r>
+        <w:t>HistoryManager.ts</w:t>
+      </w:r>
+      <w:proofErr w:type="spellEnd"/>
+      <w:r>
+        <w:t>)—allow users to step forward and backward through execution history, inspect past states, and export graphical outputs.</w:t>
       </w:r>
     </w:p>
     <w:p>
@@ -13160,7 +13811,15 @@
         <w:t>Persistence &amp; Settings:</w:t>
       </w:r>
       <w:r>
-        <w:t xml:space="preserve"> User preferences and workspace configurations are managed via a Settings Modal (SettingsModal.tsx) and persisted using browser storage.</w:t>
+        <w:t xml:space="preserve"> User preferences and workspace configurations are managed via a Settings Modal (</w:t>
+      </w:r>
+      <w:proofErr w:type="spellStart"/>
+      <w:r>
+        <w:t>SettingsModal.tsx</w:t>
+      </w:r>
+      <w:proofErr w:type="spellEnd"/>
+      <w:r>
+        <w:t>) and persisted using browser storage.</w:t>
       </w:r>
     </w:p>
     <w:p>
@@ -13360,8 +14019,11 @@
         </mc:AlternateContent>
       </w:r>
       <w:r>
+        <w:rPr>
+          <w:noProof/>
+        </w:rPr>
         <w:drawing>
-          <wp:anchor distT="0" distB="0" distL="114300" distR="114300" simplePos="0" relativeHeight="251739136" behindDoc="0" locked="0" layoutInCell="1" allowOverlap="1" wp14:anchorId="29AFFCB0" wp14:editId="5E4190EE">
+          <wp:anchor distT="0" distB="0" distL="114300" distR="114300" simplePos="0" relativeHeight="251739136" behindDoc="0" locked="0" layoutInCell="1" allowOverlap="1" wp14:anchorId="29AFFCB0" wp14:editId="21F54209">
             <wp:simplePos x="0" y="0"/>
             <wp:positionH relativeFrom="column">
               <wp:posOffset>390525</wp:posOffset>
@@ -13565,6 +14227,9 @@
         </mc:AlternateContent>
       </w:r>
       <w:r>
+        <w:rPr>
+          <w:noProof/>
+        </w:rPr>
         <w:drawing>
           <wp:anchor distT="0" distB="0" distL="114300" distR="114300" simplePos="0" relativeHeight="251742208" behindDoc="0" locked="0" layoutInCell="1" allowOverlap="1" wp14:anchorId="64EA8B96" wp14:editId="51730D93">
             <wp:simplePos x="0" y="0"/>
@@ -13805,7 +14470,15 @@
           </w:tcPr>
           <w:p>
             <w:r>
-              <w:t>NFA $\to$ DFA determinization, mirror automata, degeneralization.</w:t>
+              <w:t xml:space="preserve">NFA $\to$ DFA determinization, mirror automata, </w:t>
+            </w:r>
+            <w:proofErr w:type="spellStart"/>
+            <w:r>
+              <w:t>degeneralization</w:t>
+            </w:r>
+            <w:proofErr w:type="spellEnd"/>
+            <w:r>
+              <w:t>.</w:t>
             </w:r>
           </w:p>
           <w:p/>
@@ -13993,7 +14666,15 @@
         <w:t>A Comprehensive Algorithm Library:</w:t>
       </w:r>
       <w:r>
-        <w:t xml:space="preserve"> Built-in transformations including NFA-to-DFA determinisation, mirror automata, degeneralization, and inter-formalism conversions.</w:t>
+        <w:t xml:space="preserve"> Built-in transformations including NFA-to-DFA determinisation, mirror automata, </w:t>
+      </w:r>
+      <w:proofErr w:type="spellStart"/>
+      <w:r>
+        <w:t>degeneralization</w:t>
+      </w:r>
+      <w:proofErr w:type="spellEnd"/>
+      <w:r>
+        <w:t>, and inter-formalism conversions.</w:t>
       </w:r>
     </w:p>
     <w:p>
@@ -17589,6 +18270,7 @@
   <w:style w:type="character" w:default="1" w:styleId="DefaultParagraphFont">
     <w:name w:val="Default Paragraph Font"/>
     <w:uiPriority w:val="1"/>
+    <w:semiHidden/>
     <w:unhideWhenUsed/>
   </w:style>
   <w:style w:type="table" w:default="1" w:styleId="TableNormal">

</xml_diff>